<commit_message>
Update charter template milestones
</commit_message>
<xml_diff>
--- a/assets/project-charter-template.docx
+++ b/assets/project-charter-template.docx
@@ -8,10 +8,10 @@
         <w:tblLook w:val="04A0" w:firstRow="1" w:lastRow="0" w:firstColumn="1" w:lastColumn="0" w:noHBand="0" w:noVBand="1"/>
       </w:tblPr>
       <w:tblGrid>
-        <w:gridCol w:w="2515"/>
-        <w:gridCol w:w="2442"/>
-        <w:gridCol w:w="2126"/>
-        <w:gridCol w:w="3126"/>
+        <w:gridCol w:w="2405"/>
+        <w:gridCol w:w="2552"/>
+        <w:gridCol w:w="2693"/>
+        <w:gridCol w:w="2559"/>
         <w:gridCol w:w="222"/>
       </w:tblGrid>
       <w:tr>
@@ -50,40 +50,16 @@
               </w:rPr>
             </w:pPr>
             <w:r>
-              <w:rPr>
-                <w:rFonts w:eastAsia="Times New Roman" w:cstheme="minorHAnsi"/>
-                <w:b/>
-                <w:bCs/>
-                <w:color w:val="000000"/>
-                <w:sz w:val="36"/>
-                <w:szCs w:val="36"/>
-                <w:lang w:eastAsia="en-PH"/>
-              </w:rPr>
-              <w:t>Project Charter</w:t>
+              <w:t xml:space="preserve">Project Charter </w:t>
             </w:r>
             <w:r>
-              <w:rPr>
-                <w:rFonts w:eastAsia="Times New Roman" w:cstheme="minorHAnsi"/>
-                <w:b/>
-                <w:bCs/>
-                <w:color w:val="000000"/>
-                <w:sz w:val="36"/>
-                <w:szCs w:val="36"/>
-                <w:lang w:eastAsia="en-PH"/>
-              </w:rPr>
-              <w:t xml:space="preserve"> – </w:t>
+              <w:t>–</w:t>
             </w:r>
             <w:r>
-              <w:rPr>
-                <w:rFonts w:eastAsia="Times New Roman" w:cstheme="minorHAnsi"/>
-                <w:b/>
-                <w:bCs/>
-                <w:color w:val="000000"/>
-                <w:sz w:val="36"/>
-                <w:szCs w:val="36"/>
-                <w:lang w:eastAsia="en-PH"/>
-              </w:rPr>
-              <w:t>(insert project name here)</w:t>
+              <w:t xml:space="preserve"> </w:t>
+            </w:r>
+            <w:r>
+              <w:t>[insert project name here]</w:t>
             </w:r>
           </w:p>
         </w:tc>
@@ -96,7 +72,7 @@
         </w:trPr>
         <w:tc>
           <w:tcPr>
-            <w:tcW w:w="2515" w:type="dxa"/>
+            <w:tcW w:w="2405" w:type="dxa"/>
             <w:tcBorders>
               <w:top w:val="nil"/>
               <w:left w:val="single" w:sz="4" w:space="0" w:color="auto"/>
@@ -136,7 +112,7 @@
         </w:tc>
         <w:tc>
           <w:tcPr>
-            <w:tcW w:w="7694" w:type="dxa"/>
+            <w:tcW w:w="7804" w:type="dxa"/>
             <w:gridSpan w:val="3"/>
             <w:tcBorders>
               <w:top w:val="single" w:sz="4" w:space="0" w:color="auto"/>
@@ -159,6 +135,9 @@
                 <w:lang w:eastAsia="en-PH"/>
               </w:rPr>
             </w:pPr>
+            <w:r>
+              <w:t>[insert project name from P4CNX here]</w:t>
+            </w:r>
           </w:p>
         </w:tc>
       </w:tr>
@@ -170,7 +149,7 @@
         </w:trPr>
         <w:tc>
           <w:tcPr>
-            <w:tcW w:w="2515" w:type="dxa"/>
+            <w:tcW w:w="2405" w:type="dxa"/>
             <w:tcBorders>
               <w:top w:val="nil"/>
               <w:left w:val="single" w:sz="4" w:space="0" w:color="auto"/>
@@ -210,7 +189,7 @@
         </w:tc>
         <w:tc>
           <w:tcPr>
-            <w:tcW w:w="7694" w:type="dxa"/>
+            <w:tcW w:w="7804" w:type="dxa"/>
             <w:gridSpan w:val="3"/>
             <w:tcBorders>
               <w:top w:val="single" w:sz="4" w:space="0" w:color="auto"/>
@@ -245,7 +224,7 @@
         </w:trPr>
         <w:tc>
           <w:tcPr>
-            <w:tcW w:w="2515" w:type="dxa"/>
+            <w:tcW w:w="2405" w:type="dxa"/>
             <w:tcBorders>
               <w:top w:val="nil"/>
               <w:left w:val="single" w:sz="4" w:space="0" w:color="auto"/>
@@ -285,7 +264,32 @@
         </w:tc>
         <w:tc>
           <w:tcPr>
-            <w:tcW w:w="2442" w:type="dxa"/>
+            <w:tcW w:w="2552" w:type="dxa"/>
+            <w:tcBorders>
+              <w:top w:val="nil"/>
+              <w:left w:val="nil"/>
+              <w:bottom w:val="single" w:sz="4" w:space="0" w:color="auto"/>
+              <w:right w:val="single" w:sz="4" w:space="0" w:color="auto"/>
+            </w:tcBorders>
+            <w:noWrap/>
+            <w:vAlign w:val="center"/>
+          </w:tcPr>
+          <w:p>
+            <w:pPr>
+              <w:spacing w:after="0" w:line="240" w:lineRule="auto"/>
+              <w:rPr>
+                <w:rFonts w:eastAsia="Times New Roman" w:cstheme="minorHAnsi"/>
+                <w:color w:val="000000"/>
+                <w:sz w:val="20"/>
+                <w:szCs w:val="20"/>
+                <w:lang w:eastAsia="en-PH"/>
+              </w:rPr>
+            </w:pPr>
+          </w:p>
+        </w:tc>
+        <w:tc>
+          <w:tcPr>
+            <w:tcW w:w="2693" w:type="dxa"/>
             <w:tcBorders>
               <w:top w:val="nil"/>
               <w:left w:val="nil"/>
@@ -301,17 +305,31 @@
               <w:spacing w:after="0" w:line="240" w:lineRule="auto"/>
               <w:rPr>
                 <w:rFonts w:eastAsia="Times New Roman" w:cstheme="minorHAnsi"/>
-                <w:color w:val="000000"/>
-                <w:sz w:val="20"/>
-                <w:szCs w:val="20"/>
-                <w:lang w:eastAsia="en-PH"/>
-              </w:rPr>
-            </w:pPr>
-          </w:p>
-        </w:tc>
-        <w:tc>
-          <w:tcPr>
-            <w:tcW w:w="2126" w:type="dxa"/>
+                <w:b/>
+                <w:bCs/>
+                <w:color w:val="000000"/>
+                <w:sz w:val="20"/>
+                <w:szCs w:val="20"/>
+                <w:lang w:eastAsia="en-PH"/>
+              </w:rPr>
+            </w:pPr>
+            <w:r>
+              <w:rPr>
+                <w:rFonts w:eastAsia="Times New Roman" w:cstheme="minorHAnsi"/>
+                <w:b/>
+                <w:bCs/>
+                <w:color w:val="000000"/>
+                <w:sz w:val="20"/>
+                <w:szCs w:val="20"/>
+                <w:lang w:eastAsia="en-PH"/>
+              </w:rPr>
+              <w:t xml:space="preserve">IT Solution Architect </w:t>
+            </w:r>
+          </w:p>
+        </w:tc>
+        <w:tc>
+          <w:tcPr>
+            <w:tcW w:w="2559" w:type="dxa"/>
             <w:tcBorders>
               <w:top w:val="nil"/>
               <w:left w:val="nil"/>
@@ -327,62 +345,12 @@
               <w:spacing w:after="0" w:line="240" w:lineRule="auto"/>
               <w:rPr>
                 <w:rFonts w:eastAsia="Times New Roman" w:cstheme="minorHAnsi"/>
-                <w:b/>
-                <w:bCs/>
-                <w:color w:val="000000"/>
-                <w:sz w:val="20"/>
-                <w:szCs w:val="20"/>
-                <w:lang w:eastAsia="en-PH"/>
-              </w:rPr>
-            </w:pPr>
-            <w:r>
-              <w:rPr>
-                <w:rFonts w:eastAsia="Times New Roman" w:cstheme="minorHAnsi"/>
-                <w:b/>
-                <w:bCs/>
-                <w:color w:val="000000"/>
-                <w:sz w:val="20"/>
-                <w:szCs w:val="20"/>
-                <w:lang w:eastAsia="en-PH"/>
-              </w:rPr>
-              <w:t xml:space="preserve">IT Solution Architect </w:t>
-            </w:r>
-          </w:p>
-        </w:tc>
-        <w:tc>
-          <w:tcPr>
-            <w:tcW w:w="3126" w:type="dxa"/>
-            <w:tcBorders>
-              <w:top w:val="nil"/>
-              <w:left w:val="nil"/>
-              <w:bottom w:val="single" w:sz="4" w:space="0" w:color="auto"/>
-              <w:right w:val="single" w:sz="4" w:space="0" w:color="auto"/>
-            </w:tcBorders>
-            <w:noWrap/>
-            <w:vAlign w:val="center"/>
-            <w:hideMark/>
-          </w:tcPr>
-          <w:p>
-            <w:pPr>
-              <w:spacing w:after="0" w:line="240" w:lineRule="auto"/>
-              <w:rPr>
-                <w:rFonts w:eastAsia="Times New Roman" w:cstheme="minorHAnsi"/>
-                <w:color w:val="000000"/>
-                <w:sz w:val="20"/>
-                <w:szCs w:val="20"/>
-                <w:lang w:eastAsia="en-PH"/>
-              </w:rPr>
-            </w:pPr>
-            <w:r>
-              <w:rPr>
-                <w:rFonts w:eastAsia="Times New Roman" w:cstheme="minorHAnsi"/>
-                <w:color w:val="000000"/>
-                <w:sz w:val="20"/>
-                <w:szCs w:val="20"/>
-                <w:lang w:eastAsia="en-PH"/>
-              </w:rPr>
-              <w:t> </w:t>
-            </w:r>
+                <w:color w:val="000000"/>
+                <w:sz w:val="20"/>
+                <w:szCs w:val="20"/>
+                <w:lang w:eastAsia="en-PH"/>
+              </w:rPr>
+            </w:pPr>
           </w:p>
         </w:tc>
       </w:tr>
@@ -394,7 +362,7 @@
         </w:trPr>
         <w:tc>
           <w:tcPr>
-            <w:tcW w:w="2515" w:type="dxa"/>
+            <w:tcW w:w="2405" w:type="dxa"/>
             <w:tcBorders>
               <w:top w:val="nil"/>
               <w:left w:val="single" w:sz="4" w:space="0" w:color="auto"/>
@@ -434,7 +402,7 @@
         </w:tc>
         <w:tc>
           <w:tcPr>
-            <w:tcW w:w="2442" w:type="dxa"/>
+            <w:tcW w:w="2552" w:type="dxa"/>
             <w:tcBorders>
               <w:top w:val="nil"/>
               <w:left w:val="nil"/>
@@ -459,7 +427,7 @@
         </w:tc>
         <w:tc>
           <w:tcPr>
-            <w:tcW w:w="2126" w:type="dxa"/>
+            <w:tcW w:w="2693" w:type="dxa"/>
             <w:tcBorders>
               <w:top w:val="nil"/>
               <w:left w:val="nil"/>
@@ -499,7 +467,7 @@
         </w:tc>
         <w:tc>
           <w:tcPr>
-            <w:tcW w:w="3126" w:type="dxa"/>
+            <w:tcW w:w="2559" w:type="dxa"/>
             <w:tcBorders>
               <w:top w:val="nil"/>
               <w:left w:val="nil"/>
@@ -521,28 +489,6 @@
                 <w:lang w:eastAsia="en-PH"/>
               </w:rPr>
             </w:pPr>
-            <w:r>
-              <w:rPr>
-                <w:rFonts w:eastAsia="Times New Roman" w:cstheme="minorHAnsi"/>
-                <w:b/>
-                <w:bCs/>
-                <w:color w:val="000000"/>
-                <w:sz w:val="20"/>
-                <w:szCs w:val="20"/>
-                <w:lang w:eastAsia="en-PH"/>
-              </w:rPr>
-              <w:t> </w:t>
-            </w:r>
-            <w:r>
-              <w:rPr>
-                <w:rFonts w:eastAsia="Times New Roman" w:cstheme="minorHAnsi"/>
-                <w:color w:val="000000"/>
-                <w:sz w:val="20"/>
-                <w:szCs w:val="20"/>
-                <w:lang w:eastAsia="en-PH"/>
-              </w:rPr>
-              <w:t>(B&amp;M or WAH)</w:t>
-            </w:r>
           </w:p>
         </w:tc>
       </w:tr>
@@ -668,434 +614,6 @@
                 <w:lang w:eastAsia="en-PH"/>
               </w:rPr>
             </w:pPr>
-            <w:r>
-              <w:rPr>
-                <w:rFonts w:eastAsia="Times New Roman" w:cstheme="minorHAnsi"/>
-                <w:color w:val="EE0000"/>
-                <w:sz w:val="20"/>
-                <w:szCs w:val="20"/>
-                <w:lang w:eastAsia="en-PH"/>
-              </w:rPr>
-              <w:t>(sample only)</w:t>
-            </w:r>
-          </w:p>
-          <w:p>
-            <w:pPr>
-              <w:spacing w:after="0" w:line="240" w:lineRule="auto"/>
-              <w:rPr>
-                <w:rFonts w:eastAsia="Times New Roman" w:cstheme="minorHAnsi"/>
-                <w:color w:val="EE0000"/>
-                <w:sz w:val="20"/>
-                <w:szCs w:val="20"/>
-                <w:lang w:eastAsia="en-PH"/>
-              </w:rPr>
-            </w:pPr>
-            <w:r>
-              <w:rPr>
-                <w:rFonts w:eastAsia="Times New Roman" w:cstheme="minorHAnsi"/>
-                <w:color w:val="EE0000"/>
-                <w:sz w:val="20"/>
-                <w:szCs w:val="20"/>
-                <w:lang w:eastAsia="en-PH"/>
-              </w:rPr>
-              <w:t>NETWORK</w:t>
-            </w:r>
-          </w:p>
-          <w:p>
-            <w:pPr>
-              <w:numPr>
-                <w:ilvl w:val="0"/>
-                <w:numId w:val="21"/>
-              </w:numPr>
-              <w:spacing w:after="0" w:line="240" w:lineRule="auto"/>
-              <w:rPr>
-                <w:rFonts w:eastAsia="Times New Roman" w:cstheme="minorHAnsi"/>
-                <w:color w:val="EE0000"/>
-                <w:sz w:val="20"/>
-                <w:szCs w:val="20"/>
-                <w:lang w:eastAsia="en-PH"/>
-              </w:rPr>
-            </w:pPr>
-            <w:r>
-              <w:rPr>
-                <w:rFonts w:eastAsia="Times New Roman" w:cstheme="minorHAnsi"/>
-                <w:color w:val="EE0000"/>
-                <w:sz w:val="20"/>
-                <w:szCs w:val="20"/>
-                <w:lang w:val="en-US" w:eastAsia="en-PH"/>
-              </w:rPr>
-              <w:t>Applications (including Voice) accessed over client-provided MPLS into ODC/CDC</w:t>
-            </w:r>
-          </w:p>
-          <w:p>
-            <w:pPr>
-              <w:numPr>
-                <w:ilvl w:val="0"/>
-                <w:numId w:val="21"/>
-              </w:numPr>
-              <w:spacing w:after="0" w:line="240" w:lineRule="auto"/>
-              <w:rPr>
-                <w:rFonts w:eastAsia="Times New Roman" w:cstheme="minorHAnsi"/>
-                <w:color w:val="EE0000"/>
-                <w:sz w:val="20"/>
-                <w:szCs w:val="20"/>
-                <w:lang w:eastAsia="en-PH"/>
-              </w:rPr>
-            </w:pPr>
-            <w:r>
-              <w:rPr>
-                <w:rFonts w:eastAsia="Times New Roman" w:cstheme="minorHAnsi"/>
-                <w:color w:val="EE0000"/>
-                <w:sz w:val="20"/>
-                <w:szCs w:val="20"/>
-                <w:lang w:val="en-US" w:eastAsia="en-PH"/>
-              </w:rPr>
-              <w:t>Standard MPLS BW: 150Kbps (voice and data)</w:t>
-            </w:r>
-          </w:p>
-          <w:p>
-            <w:pPr>
-              <w:numPr>
-                <w:ilvl w:val="0"/>
-                <w:numId w:val="21"/>
-              </w:numPr>
-              <w:spacing w:after="0" w:line="240" w:lineRule="auto"/>
-              <w:rPr>
-                <w:rFonts w:eastAsia="Times New Roman" w:cstheme="minorHAnsi"/>
-                <w:color w:val="EE0000"/>
-                <w:sz w:val="20"/>
-                <w:szCs w:val="20"/>
-                <w:lang w:eastAsia="en-PH"/>
-              </w:rPr>
-            </w:pPr>
-            <w:r>
-              <w:rPr>
-                <w:rFonts w:eastAsia="Times New Roman" w:cstheme="minorHAnsi"/>
-                <w:color w:val="EE0000"/>
-                <w:sz w:val="20"/>
-                <w:szCs w:val="20"/>
-                <w:lang w:val="en-US" w:eastAsia="en-PH"/>
-              </w:rPr>
-              <w:t>Shared LAN with logical separation using VLANs</w:t>
-            </w:r>
-          </w:p>
-          <w:p>
-            <w:pPr>
-              <w:spacing w:after="0" w:line="240" w:lineRule="auto"/>
-              <w:rPr>
-                <w:rFonts w:eastAsia="Times New Roman" w:cstheme="minorHAnsi"/>
-                <w:color w:val="EE0000"/>
-                <w:sz w:val="20"/>
-                <w:szCs w:val="20"/>
-                <w:lang w:val="en-US" w:eastAsia="en-PH"/>
-              </w:rPr>
-            </w:pPr>
-            <w:r>
-              <w:rPr>
-                <w:rFonts w:eastAsia="Times New Roman" w:cstheme="minorHAnsi"/>
-                <w:color w:val="EE0000"/>
-                <w:sz w:val="20"/>
-                <w:szCs w:val="20"/>
-                <w:lang w:val="en-US" w:eastAsia="en-PH"/>
-              </w:rPr>
-              <w:t>VOICE</w:t>
-            </w:r>
-          </w:p>
-          <w:p>
-            <w:pPr>
-              <w:numPr>
-                <w:ilvl w:val="0"/>
-                <w:numId w:val="22"/>
-              </w:numPr>
-              <w:spacing w:after="0" w:line="240" w:lineRule="auto"/>
-              <w:rPr>
-                <w:rFonts w:eastAsia="Times New Roman" w:cstheme="minorHAnsi"/>
-                <w:color w:val="EE0000"/>
-                <w:sz w:val="20"/>
-                <w:szCs w:val="20"/>
-                <w:lang w:eastAsia="en-PH"/>
-              </w:rPr>
-            </w:pPr>
-            <w:r>
-              <w:rPr>
-                <w:rFonts w:eastAsia="Times New Roman" w:cstheme="minorHAnsi"/>
-                <w:color w:val="EE0000"/>
-                <w:sz w:val="20"/>
-                <w:szCs w:val="20"/>
-                <w:lang w:val="en-US" w:eastAsia="en-PH"/>
-              </w:rPr>
-              <w:t>IB/OB support</w:t>
-            </w:r>
-          </w:p>
-          <w:p>
-            <w:pPr>
-              <w:numPr>
-                <w:ilvl w:val="0"/>
-                <w:numId w:val="22"/>
-              </w:numPr>
-              <w:spacing w:after="0" w:line="240" w:lineRule="auto"/>
-              <w:rPr>
-                <w:rFonts w:eastAsia="Times New Roman" w:cstheme="minorHAnsi"/>
-                <w:color w:val="EE0000"/>
-                <w:sz w:val="20"/>
-                <w:szCs w:val="20"/>
-                <w:lang w:eastAsia="en-PH"/>
-              </w:rPr>
-            </w:pPr>
-            <w:proofErr w:type="gramStart"/>
-            <w:r>
-              <w:rPr>
-                <w:rFonts w:eastAsia="Times New Roman" w:cstheme="minorHAnsi"/>
-                <w:color w:val="EE0000"/>
-                <w:sz w:val="20"/>
-                <w:szCs w:val="20"/>
-                <w:lang w:val="en-US" w:eastAsia="en-PH"/>
-              </w:rPr>
-              <w:t>Agents</w:t>
-            </w:r>
-            <w:proofErr w:type="gramEnd"/>
-            <w:r>
-              <w:rPr>
-                <w:rFonts w:eastAsia="Times New Roman" w:cstheme="minorHAnsi"/>
-                <w:color w:val="EE0000"/>
-                <w:sz w:val="20"/>
-                <w:szCs w:val="20"/>
-                <w:lang w:val="en-US" w:eastAsia="en-PH"/>
-              </w:rPr>
-              <w:t xml:space="preserve"> login to CNX Avaya One X PBX with SIP trunks to client-provided Genesys </w:t>
-            </w:r>
-            <w:proofErr w:type="spellStart"/>
-            <w:r>
-              <w:rPr>
-                <w:rFonts w:eastAsia="Times New Roman" w:cstheme="minorHAnsi"/>
-                <w:color w:val="EE0000"/>
-                <w:sz w:val="20"/>
-                <w:szCs w:val="20"/>
-                <w:lang w:val="en-US" w:eastAsia="en-PH"/>
-              </w:rPr>
-              <w:t>Purecloud</w:t>
-            </w:r>
-            <w:proofErr w:type="spellEnd"/>
-            <w:r>
-              <w:rPr>
-                <w:rFonts w:eastAsia="Times New Roman" w:cstheme="minorHAnsi"/>
-                <w:color w:val="EE0000"/>
-                <w:sz w:val="20"/>
-                <w:szCs w:val="20"/>
-                <w:lang w:val="en-US" w:eastAsia="en-PH"/>
-              </w:rPr>
-              <w:t xml:space="preserve"> ACD</w:t>
-            </w:r>
-          </w:p>
-          <w:p>
-            <w:pPr>
-              <w:numPr>
-                <w:ilvl w:val="0"/>
-                <w:numId w:val="22"/>
-              </w:numPr>
-              <w:spacing w:after="0" w:line="240" w:lineRule="auto"/>
-              <w:rPr>
-                <w:rFonts w:eastAsia="Times New Roman" w:cstheme="minorHAnsi"/>
-                <w:color w:val="EE0000"/>
-                <w:sz w:val="20"/>
-                <w:szCs w:val="20"/>
-                <w:lang w:eastAsia="en-PH"/>
-              </w:rPr>
-            </w:pPr>
-            <w:r>
-              <w:rPr>
-                <w:rFonts w:eastAsia="Times New Roman" w:cstheme="minorHAnsi"/>
-                <w:color w:val="EE0000"/>
-                <w:sz w:val="20"/>
-                <w:szCs w:val="20"/>
-                <w:lang w:val="en-US" w:eastAsia="en-PH"/>
-              </w:rPr>
-              <w:t>Call recording – provided by client</w:t>
-            </w:r>
-          </w:p>
-          <w:p>
-            <w:pPr>
-              <w:numPr>
-                <w:ilvl w:val="0"/>
-                <w:numId w:val="22"/>
-              </w:numPr>
-              <w:spacing w:after="0" w:line="240" w:lineRule="auto"/>
-              <w:rPr>
-                <w:rFonts w:eastAsia="Times New Roman" w:cstheme="minorHAnsi"/>
-                <w:color w:val="EE0000"/>
-                <w:sz w:val="20"/>
-                <w:szCs w:val="20"/>
-                <w:lang w:eastAsia="en-PH"/>
-              </w:rPr>
-            </w:pPr>
-            <w:r>
-              <w:rPr>
-                <w:rFonts w:eastAsia="Times New Roman" w:cstheme="minorHAnsi"/>
-                <w:color w:val="EE0000"/>
-                <w:sz w:val="20"/>
-                <w:szCs w:val="20"/>
-                <w:lang w:val="en-US" w:eastAsia="en-PH"/>
-              </w:rPr>
-              <w:t>Call reporting – provided by client</w:t>
-            </w:r>
-          </w:p>
-          <w:p>
-            <w:pPr>
-              <w:spacing w:after="0" w:line="240" w:lineRule="auto"/>
-              <w:rPr>
-                <w:rFonts w:eastAsia="Times New Roman" w:cstheme="minorHAnsi"/>
-                <w:color w:val="EE0000"/>
-                <w:sz w:val="20"/>
-                <w:szCs w:val="20"/>
-                <w:lang w:eastAsia="en-PH"/>
-              </w:rPr>
-            </w:pPr>
-            <w:r>
-              <w:rPr>
-                <w:rFonts w:eastAsia="Times New Roman" w:cstheme="minorHAnsi"/>
-                <w:color w:val="EE0000"/>
-                <w:sz w:val="20"/>
-                <w:szCs w:val="20"/>
-                <w:lang w:val="en-US" w:eastAsia="en-PH"/>
-              </w:rPr>
-              <w:t>S</w:t>
-            </w:r>
-            <w:r>
-              <w:rPr>
-                <w:rFonts w:eastAsia="Times New Roman" w:cstheme="minorHAnsi"/>
-                <w:color w:val="EE0000"/>
-                <w:sz w:val="20"/>
-                <w:szCs w:val="20"/>
-                <w:lang w:val="en-US" w:eastAsia="en-PH"/>
-              </w:rPr>
-              <w:t>ECURITY / PRIVACY</w:t>
-            </w:r>
-          </w:p>
-          <w:p>
-            <w:pPr>
-              <w:numPr>
-                <w:ilvl w:val="0"/>
-                <w:numId w:val="23"/>
-              </w:numPr>
-              <w:spacing w:after="0" w:line="240" w:lineRule="auto"/>
-              <w:rPr>
-                <w:rFonts w:eastAsia="Times New Roman" w:cstheme="minorHAnsi"/>
-                <w:color w:val="EE0000"/>
-                <w:sz w:val="20"/>
-                <w:szCs w:val="20"/>
-                <w:lang w:eastAsia="en-PH"/>
-              </w:rPr>
-            </w:pPr>
-            <w:r>
-              <w:rPr>
-                <w:rFonts w:eastAsia="Times New Roman" w:cstheme="minorHAnsi"/>
-                <w:color w:val="EE0000"/>
-                <w:sz w:val="20"/>
-                <w:szCs w:val="20"/>
-                <w:lang w:val="en-US" w:eastAsia="en-PH"/>
-              </w:rPr>
-              <w:t>CNX security standards are considered</w:t>
-            </w:r>
-          </w:p>
-          <w:p>
-            <w:pPr>
-              <w:numPr>
-                <w:ilvl w:val="0"/>
-                <w:numId w:val="23"/>
-              </w:numPr>
-              <w:spacing w:after="0" w:line="240" w:lineRule="auto"/>
-              <w:rPr>
-                <w:rFonts w:eastAsia="Times New Roman" w:cstheme="minorHAnsi"/>
-                <w:color w:val="EE0000"/>
-                <w:sz w:val="20"/>
-                <w:szCs w:val="20"/>
-                <w:lang w:eastAsia="en-PH"/>
-              </w:rPr>
-            </w:pPr>
-            <w:r>
-              <w:rPr>
-                <w:rFonts w:eastAsia="Times New Roman" w:cstheme="minorHAnsi"/>
-                <w:color w:val="EE0000"/>
-                <w:sz w:val="20"/>
-                <w:szCs w:val="20"/>
-                <w:lang w:val="en-US" w:eastAsia="en-PH"/>
-              </w:rPr>
-              <w:t>PCI required</w:t>
-            </w:r>
-          </w:p>
-          <w:p>
-            <w:pPr>
-              <w:numPr>
-                <w:ilvl w:val="0"/>
-                <w:numId w:val="23"/>
-              </w:numPr>
-              <w:spacing w:after="0" w:line="240" w:lineRule="auto"/>
-              <w:rPr>
-                <w:rFonts w:eastAsia="Times New Roman" w:cstheme="minorHAnsi"/>
-                <w:color w:val="EE0000"/>
-                <w:sz w:val="20"/>
-                <w:szCs w:val="20"/>
-                <w:lang w:eastAsia="en-PH"/>
-              </w:rPr>
-            </w:pPr>
-            <w:r>
-              <w:rPr>
-                <w:rFonts w:eastAsia="Times New Roman" w:cstheme="minorHAnsi"/>
-                <w:color w:val="EE0000"/>
-                <w:sz w:val="20"/>
-                <w:szCs w:val="20"/>
-                <w:lang w:val="en-US" w:eastAsia="en-PH"/>
-              </w:rPr>
-              <w:t>No data masking required</w:t>
-            </w:r>
-          </w:p>
-          <w:p>
-            <w:pPr>
-              <w:numPr>
-                <w:ilvl w:val="0"/>
-                <w:numId w:val="25"/>
-              </w:numPr>
-              <w:spacing w:after="0" w:line="240" w:lineRule="auto"/>
-              <w:rPr>
-                <w:rFonts w:eastAsia="Times New Roman" w:cstheme="minorHAnsi"/>
-                <w:color w:val="EE0000"/>
-                <w:sz w:val="20"/>
-                <w:szCs w:val="20"/>
-                <w:lang w:eastAsia="en-PH"/>
-              </w:rPr>
-            </w:pPr>
-            <w:r>
-              <w:rPr>
-                <w:rFonts w:eastAsia="Times New Roman" w:cstheme="minorHAnsi"/>
-                <w:color w:val="EE0000"/>
-                <w:sz w:val="20"/>
-                <w:szCs w:val="20"/>
-                <w:lang w:val="en-US" w:eastAsia="en-PH"/>
-              </w:rPr>
-              <w:t xml:space="preserve">BC/DR – </w:t>
-            </w:r>
-            <w:r>
-              <w:rPr>
-                <w:rFonts w:eastAsia="Times New Roman" w:cstheme="minorHAnsi"/>
-                <w:color w:val="EE0000"/>
-                <w:sz w:val="20"/>
-                <w:szCs w:val="20"/>
-                <w:lang w:val="en-US" w:eastAsia="en-PH"/>
-              </w:rPr>
-              <w:t>Site hardening</w:t>
-            </w:r>
-          </w:p>
-          <w:p>
-            <w:pPr>
-              <w:spacing w:after="0" w:line="240" w:lineRule="auto"/>
-              <w:rPr>
-                <w:rFonts w:eastAsia="Times New Roman" w:cstheme="minorHAnsi"/>
-                <w:color w:val="EE0000"/>
-                <w:sz w:val="20"/>
-                <w:szCs w:val="20"/>
-                <w:lang w:eastAsia="en-PH"/>
-              </w:rPr>
-            </w:pPr>
           </w:p>
         </w:tc>
         <w:tc>
@@ -1117,221 +635,6 @@
               <w:rPr>
                 <w:rFonts w:eastAsia="Times New Roman" w:cstheme="minorHAnsi"/>
                 <w:color w:val="EE0000"/>
-                <w:sz w:val="20"/>
-                <w:szCs w:val="20"/>
-                <w:lang w:eastAsia="en-PH"/>
-              </w:rPr>
-            </w:pPr>
-            <w:r>
-              <w:rPr>
-                <w:rFonts w:eastAsia="Times New Roman" w:cstheme="minorHAnsi"/>
-                <w:color w:val="EE0000"/>
-                <w:sz w:val="20"/>
-                <w:szCs w:val="20"/>
-                <w:lang w:eastAsia="en-PH"/>
-              </w:rPr>
-              <w:t>(sample only)</w:t>
-            </w:r>
-          </w:p>
-          <w:p>
-            <w:pPr>
-              <w:pStyle w:val="ListParagraph"/>
-              <w:numPr>
-                <w:ilvl w:val="0"/>
-                <w:numId w:val="1"/>
-              </w:numPr>
-              <w:rPr>
-                <w:rFonts w:eastAsia="Times New Roman" w:cstheme="minorHAnsi"/>
-                <w:color w:val="EE0000"/>
-                <w:sz w:val="20"/>
-                <w:szCs w:val="20"/>
-                <w:lang w:eastAsia="en-PH"/>
-              </w:rPr>
-            </w:pPr>
-            <w:r>
-              <w:rPr>
-                <w:rFonts w:eastAsia="Times New Roman" w:cstheme="minorHAnsi"/>
-                <w:color w:val="EE0000"/>
-                <w:sz w:val="20"/>
-                <w:szCs w:val="20"/>
-                <w:lang w:eastAsia="en-PH"/>
-              </w:rPr>
-              <w:t>NETWORK</w:t>
-            </w:r>
-            <w:r>
-              <w:rPr>
-                <w:rFonts w:eastAsia="Times New Roman" w:cstheme="minorHAnsi"/>
-                <w:color w:val="EE0000"/>
-                <w:sz w:val="20"/>
-                <w:szCs w:val="20"/>
-                <w:lang w:eastAsia="en-PH"/>
-              </w:rPr>
-              <w:t xml:space="preserve"> – VLAN creation, build, </w:t>
-            </w:r>
-            <w:r>
-              <w:rPr>
-                <w:rFonts w:eastAsia="Times New Roman" w:cstheme="minorHAnsi"/>
-                <w:color w:val="EE0000"/>
-                <w:sz w:val="20"/>
-                <w:szCs w:val="20"/>
-                <w:lang w:eastAsia="en-PH"/>
-              </w:rPr>
-              <w:t>routing, Port Conversion</w:t>
-            </w:r>
-          </w:p>
-          <w:p>
-            <w:pPr>
-              <w:pStyle w:val="ListParagraph"/>
-              <w:numPr>
-                <w:ilvl w:val="0"/>
-                <w:numId w:val="1"/>
-              </w:numPr>
-              <w:rPr>
-                <w:rFonts w:eastAsia="Times New Roman" w:cstheme="minorHAnsi"/>
-                <w:color w:val="EE0000"/>
-                <w:sz w:val="20"/>
-                <w:szCs w:val="20"/>
-                <w:lang w:eastAsia="en-PH"/>
-              </w:rPr>
-            </w:pPr>
-            <w:r>
-              <w:rPr>
-                <w:rFonts w:eastAsia="Times New Roman" w:cstheme="minorHAnsi"/>
-                <w:color w:val="EE0000"/>
-                <w:sz w:val="20"/>
-                <w:szCs w:val="20"/>
-                <w:lang w:eastAsia="en-PH"/>
-              </w:rPr>
-              <w:t>SERVER</w:t>
-            </w:r>
-            <w:r>
-              <w:rPr>
-                <w:rFonts w:eastAsia="Times New Roman" w:cstheme="minorHAnsi"/>
-                <w:color w:val="EE0000"/>
-                <w:sz w:val="20"/>
-                <w:szCs w:val="20"/>
-                <w:lang w:eastAsia="en-PH"/>
-              </w:rPr>
-              <w:t xml:space="preserve"> – OU creation, DHCP build, GPO build with PCI</w:t>
-            </w:r>
-          </w:p>
-          <w:p>
-            <w:pPr>
-              <w:pStyle w:val="ListParagraph"/>
-              <w:numPr>
-                <w:ilvl w:val="0"/>
-                <w:numId w:val="1"/>
-              </w:numPr>
-              <w:spacing w:after="0" w:line="240" w:lineRule="auto"/>
-              <w:rPr>
-                <w:rFonts w:eastAsia="Times New Roman" w:cstheme="minorHAnsi"/>
-                <w:color w:val="EE0000"/>
-                <w:sz w:val="20"/>
-                <w:szCs w:val="20"/>
-                <w:lang w:eastAsia="en-PH"/>
-              </w:rPr>
-            </w:pPr>
-            <w:r>
-              <w:rPr>
-                <w:rFonts w:eastAsia="Times New Roman" w:cstheme="minorHAnsi"/>
-                <w:color w:val="EE0000"/>
-                <w:sz w:val="20"/>
-                <w:szCs w:val="20"/>
-                <w:lang w:eastAsia="en-PH"/>
-              </w:rPr>
-              <w:t>VOICE</w:t>
-            </w:r>
-            <w:r>
-              <w:rPr>
-                <w:rFonts w:eastAsia="Times New Roman" w:cstheme="minorHAnsi"/>
-                <w:color w:val="EE0000"/>
-                <w:sz w:val="20"/>
-                <w:szCs w:val="20"/>
-                <w:lang w:eastAsia="en-PH"/>
-              </w:rPr>
-              <w:t xml:space="preserve"> – Phone Extensions for Avaya passthrough</w:t>
-            </w:r>
-          </w:p>
-          <w:p>
-            <w:pPr>
-              <w:pStyle w:val="ListParagraph"/>
-              <w:numPr>
-                <w:ilvl w:val="0"/>
-                <w:numId w:val="1"/>
-              </w:numPr>
-              <w:spacing w:after="0" w:line="240" w:lineRule="auto"/>
-              <w:rPr>
-                <w:rFonts w:eastAsia="Times New Roman" w:cstheme="minorHAnsi"/>
-                <w:color w:val="EE0000"/>
-                <w:sz w:val="20"/>
-                <w:szCs w:val="20"/>
-                <w:lang w:eastAsia="en-PH"/>
-              </w:rPr>
-            </w:pPr>
-            <w:r>
-              <w:rPr>
-                <w:rFonts w:eastAsia="Times New Roman" w:cstheme="minorHAnsi"/>
-                <w:color w:val="EE0000"/>
-                <w:sz w:val="20"/>
-                <w:szCs w:val="20"/>
-                <w:lang w:eastAsia="en-PH"/>
-              </w:rPr>
-              <w:t xml:space="preserve">IT ASSET – CNX standard </w:t>
-            </w:r>
-            <w:r>
-              <w:rPr>
-                <w:rFonts w:eastAsia="Times New Roman" w:cstheme="minorHAnsi"/>
-                <w:color w:val="EE0000"/>
-                <w:sz w:val="20"/>
-                <w:szCs w:val="20"/>
-                <w:lang w:eastAsia="en-PH"/>
-              </w:rPr>
-              <w:t>desktop, standard dual monitors, USB headset (for softphones)</w:t>
-            </w:r>
-          </w:p>
-          <w:p>
-            <w:pPr>
-              <w:pStyle w:val="ListParagraph"/>
-              <w:numPr>
-                <w:ilvl w:val="0"/>
-                <w:numId w:val="1"/>
-              </w:numPr>
-              <w:spacing w:after="0" w:line="240" w:lineRule="auto"/>
-              <w:rPr>
-                <w:rFonts w:eastAsia="Times New Roman" w:cstheme="minorHAnsi"/>
-                <w:color w:val="EE0000"/>
-                <w:sz w:val="20"/>
-                <w:szCs w:val="20"/>
-                <w:lang w:eastAsia="en-PH"/>
-              </w:rPr>
-            </w:pPr>
-            <w:r>
-              <w:rPr>
-                <w:rFonts w:eastAsia="Times New Roman" w:cstheme="minorHAnsi"/>
-                <w:color w:val="EE0000"/>
-                <w:sz w:val="20"/>
-                <w:szCs w:val="20"/>
-                <w:lang w:eastAsia="en-PH"/>
-              </w:rPr>
-              <w:t xml:space="preserve">TECH-INFUSED - </w:t>
-            </w:r>
-            <w:r>
-              <w:rPr>
-                <w:rFonts w:eastAsia="Times New Roman" w:cstheme="minorHAnsi"/>
-                <w:color w:val="EE0000"/>
-                <w:sz w:val="20"/>
-                <w:szCs w:val="20"/>
-                <w:lang w:val="en-US" w:eastAsia="en-PH"/>
-              </w:rPr>
-              <w:t>Quick Connect, FMS, Advisor XP, TALES, GRADE, AAL, ALBA, Pulse</w:t>
-            </w:r>
-          </w:p>
-          <w:p>
-            <w:pPr>
-              <w:spacing w:after="0" w:line="240" w:lineRule="auto"/>
-              <w:rPr>
-                <w:rFonts w:eastAsia="Times New Roman" w:cstheme="minorHAnsi"/>
-                <w:color w:val="000000"/>
                 <w:sz w:val="20"/>
                 <w:szCs w:val="20"/>
                 <w:lang w:eastAsia="en-PH"/>
@@ -2028,7 +1331,7 @@
         </w:trPr>
         <w:tc>
           <w:tcPr>
-            <w:tcW w:w="2515" w:type="dxa"/>
+            <w:tcW w:w="2405" w:type="dxa"/>
             <w:tcBorders>
               <w:top w:val="nil"/>
               <w:left w:val="single" w:sz="4" w:space="0" w:color="auto"/>
@@ -2069,7 +1372,7 @@
         </w:tc>
         <w:tc>
           <w:tcPr>
-            <w:tcW w:w="2442" w:type="dxa"/>
+            <w:tcW w:w="2552" w:type="dxa"/>
             <w:tcBorders>
               <w:top w:val="nil"/>
               <w:left w:val="nil"/>
@@ -2110,7 +1413,7 @@
         </w:tc>
         <w:tc>
           <w:tcPr>
-            <w:tcW w:w="2126" w:type="dxa"/>
+            <w:tcW w:w="2693" w:type="dxa"/>
             <w:tcBorders>
               <w:top w:val="nil"/>
               <w:left w:val="nil"/>
@@ -2119,13 +1422,14 @@
             </w:tcBorders>
             <w:noWrap/>
             <w:vAlign w:val="bottom"/>
-            <w:hideMark/>
-          </w:tcPr>
-          <w:p>
-            <w:pPr>
-              <w:spacing w:after="0" w:line="240" w:lineRule="auto"/>
-              <w:rPr>
-                <w:rFonts w:eastAsia="Times New Roman" w:cstheme="minorHAnsi"/>
+          </w:tcPr>
+          <w:p>
+            <w:pPr>
+              <w:spacing w:after="0" w:line="240" w:lineRule="auto"/>
+              <w:rPr>
+                <w:rFonts w:eastAsia="Times New Roman" w:cstheme="minorHAnsi"/>
+                <w:b/>
+                <w:bCs/>
                 <w:color w:val="000000"/>
                 <w:sz w:val="20"/>
                 <w:szCs w:val="20"/>
@@ -2135,18 +1439,20 @@
             <w:r>
               <w:rPr>
                 <w:rFonts w:eastAsia="Times New Roman" w:cstheme="minorHAnsi"/>
-                <w:color w:val="000000"/>
-                <w:sz w:val="20"/>
-                <w:szCs w:val="20"/>
-                <w:lang w:eastAsia="en-PH"/>
-              </w:rPr>
-              <w:t>Train the trainer</w:t>
+                <w:b/>
+                <w:bCs/>
+                <w:color w:val="000000"/>
+                <w:sz w:val="20"/>
+                <w:szCs w:val="20"/>
+                <w:lang w:eastAsia="en-PH"/>
+              </w:rPr>
+              <w:t>Solution Handover Date</w:t>
             </w:r>
           </w:p>
         </w:tc>
         <w:tc>
           <w:tcPr>
-            <w:tcW w:w="3126" w:type="dxa"/>
+            <w:tcW w:w="2559" w:type="dxa"/>
             <w:tcBorders>
               <w:top w:val="nil"/>
               <w:left w:val="nil"/>
@@ -2155,59 +1461,18 @@
             </w:tcBorders>
             <w:noWrap/>
             <w:vAlign w:val="bottom"/>
-            <w:hideMark/>
-          </w:tcPr>
-          <w:p>
-            <w:pPr>
-              <w:spacing w:after="0" w:line="240" w:lineRule="auto"/>
-              <w:rPr>
-                <w:rFonts w:eastAsia="Times New Roman" w:cstheme="minorHAnsi"/>
-                <w:color w:val="000000"/>
-                <w:sz w:val="20"/>
-                <w:szCs w:val="20"/>
-                <w:lang w:eastAsia="en-PH"/>
-              </w:rPr>
-            </w:pPr>
-            <w:r>
-              <w:rPr>
-                <w:rFonts w:eastAsia="Times New Roman" w:cstheme="minorHAnsi"/>
-                <w:color w:val="000000"/>
-                <w:sz w:val="20"/>
-                <w:szCs w:val="20"/>
-                <w:lang w:eastAsia="en-PH"/>
-              </w:rPr>
-              <w:t xml:space="preserve">5/29/23 </w:t>
-            </w:r>
-            <w:r>
-              <w:rPr>
-                <w:rFonts w:eastAsia="Times New Roman" w:cstheme="minorHAnsi"/>
-                <w:color w:val="000000"/>
-                <w:sz w:val="20"/>
-                <w:szCs w:val="20"/>
-                <w:lang w:eastAsia="en-PH"/>
-              </w:rPr>
-              <w:t>–</w:t>
-            </w:r>
-            <w:r>
-              <w:rPr>
-                <w:rFonts w:eastAsia="Times New Roman" w:cstheme="minorHAnsi"/>
-                <w:color w:val="000000"/>
-                <w:sz w:val="20"/>
-                <w:szCs w:val="20"/>
-                <w:lang w:eastAsia="en-PH"/>
-              </w:rPr>
-              <w:t xml:space="preserve"> </w:t>
-            </w:r>
-            <w:r>
-              <w:rPr>
-                <w:rFonts w:eastAsia="Times New Roman" w:cstheme="minorHAnsi"/>
-                <w:color w:val="000000"/>
-                <w:sz w:val="20"/>
-                <w:szCs w:val="20"/>
-                <w:lang w:eastAsia="en-PH"/>
-              </w:rPr>
-              <w:t>6/2/23</w:t>
-            </w:r>
+          </w:tcPr>
+          <w:p>
+            <w:pPr>
+              <w:spacing w:after="0" w:line="240" w:lineRule="auto"/>
+              <w:rPr>
+                <w:rFonts w:eastAsia="Times New Roman" w:cstheme="minorHAnsi"/>
+                <w:color w:val="000000"/>
+                <w:sz w:val="20"/>
+                <w:szCs w:val="20"/>
+                <w:lang w:eastAsia="en-PH"/>
+              </w:rPr>
+            </w:pPr>
           </w:p>
         </w:tc>
         <w:tc>
@@ -2235,7 +1500,7 @@
         </w:trPr>
         <w:tc>
           <w:tcPr>
-            <w:tcW w:w="2515" w:type="dxa"/>
+            <w:tcW w:w="2405" w:type="dxa"/>
             <w:tcBorders>
               <w:top w:val="nil"/>
               <w:left w:val="single" w:sz="4" w:space="0" w:color="auto"/>
@@ -2260,7 +1525,7 @@
         </w:tc>
         <w:tc>
           <w:tcPr>
-            <w:tcW w:w="2442" w:type="dxa"/>
+            <w:tcW w:w="2552" w:type="dxa"/>
             <w:tcBorders>
               <w:top w:val="nil"/>
               <w:left w:val="nil"/>
@@ -2282,21 +1547,11 @@
                 <w:lang w:eastAsia="en-PH"/>
               </w:rPr>
             </w:pPr>
-            <w:r>
-              <w:rPr>
-                <w:rFonts w:eastAsia="Times New Roman" w:cstheme="minorHAnsi"/>
-                <w:color w:val="000000"/>
-                <w:sz w:val="20"/>
-                <w:szCs w:val="20"/>
-                <w:lang w:eastAsia="en-PH"/>
-              </w:rPr>
-              <w:t>Network</w:t>
-            </w:r>
-          </w:p>
-        </w:tc>
-        <w:tc>
-          <w:tcPr>
-            <w:tcW w:w="2126" w:type="dxa"/>
+          </w:p>
+        </w:tc>
+        <w:tc>
+          <w:tcPr>
+            <w:tcW w:w="2693" w:type="dxa"/>
             <w:tcBorders>
               <w:top w:val="nil"/>
               <w:left w:val="nil"/>
@@ -2305,13 +1560,14 @@
             </w:tcBorders>
             <w:noWrap/>
             <w:vAlign w:val="bottom"/>
-            <w:hideMark/>
-          </w:tcPr>
-          <w:p>
-            <w:pPr>
-              <w:spacing w:after="0" w:line="240" w:lineRule="auto"/>
-              <w:rPr>
-                <w:rFonts w:eastAsia="Times New Roman" w:cstheme="minorHAnsi"/>
+          </w:tcPr>
+          <w:p>
+            <w:pPr>
+              <w:spacing w:after="0" w:line="240" w:lineRule="auto"/>
+              <w:rPr>
+                <w:rFonts w:eastAsia="Times New Roman" w:cstheme="minorHAnsi"/>
+                <w:b/>
+                <w:bCs/>
                 <w:color w:val="000000"/>
                 <w:sz w:val="20"/>
                 <w:szCs w:val="20"/>
@@ -2321,18 +1577,20 @@
             <w:r>
               <w:rPr>
                 <w:rFonts w:eastAsia="Times New Roman" w:cstheme="minorHAnsi"/>
-                <w:color w:val="000000"/>
-                <w:sz w:val="20"/>
-                <w:szCs w:val="20"/>
-                <w:lang w:eastAsia="en-PH"/>
-              </w:rPr>
-              <w:t>CET</w:t>
+                <w:b/>
+                <w:bCs/>
+                <w:color w:val="000000"/>
+                <w:sz w:val="20"/>
+                <w:szCs w:val="20"/>
+                <w:lang w:eastAsia="en-PH"/>
+              </w:rPr>
+              <w:t>IT Kick-off Call</w:t>
             </w:r>
           </w:p>
         </w:tc>
         <w:tc>
           <w:tcPr>
-            <w:tcW w:w="3126" w:type="dxa"/>
+            <w:tcW w:w="2559" w:type="dxa"/>
             <w:tcBorders>
               <w:top w:val="nil"/>
               <w:left w:val="nil"/>
@@ -2353,16 +1611,6 @@
                 <w:lang w:eastAsia="en-PH"/>
               </w:rPr>
             </w:pPr>
-            <w:r>
-              <w:rPr>
-                <w:rFonts w:eastAsia="Times New Roman" w:cstheme="minorHAnsi"/>
-                <w:color w:val="000000"/>
-                <w:sz w:val="20"/>
-                <w:szCs w:val="20"/>
-                <w:lang w:eastAsia="en-PH"/>
-              </w:rPr>
-              <w:t>5/29/23 – 6/2/23</w:t>
-            </w:r>
           </w:p>
         </w:tc>
         <w:tc>
@@ -2390,7 +1638,7 @@
         </w:trPr>
         <w:tc>
           <w:tcPr>
-            <w:tcW w:w="2515" w:type="dxa"/>
+            <w:tcW w:w="2405" w:type="dxa"/>
             <w:tcBorders>
               <w:top w:val="nil"/>
               <w:left w:val="single" w:sz="4" w:space="0" w:color="auto"/>
@@ -2415,7 +1663,7 @@
         </w:tc>
         <w:tc>
           <w:tcPr>
-            <w:tcW w:w="2442" w:type="dxa"/>
+            <w:tcW w:w="2552" w:type="dxa"/>
             <w:tcBorders>
               <w:top w:val="nil"/>
               <w:left w:val="nil"/>
@@ -2437,21 +1685,11 @@
                 <w:lang w:eastAsia="en-PH"/>
               </w:rPr>
             </w:pPr>
-            <w:r>
-              <w:rPr>
-                <w:rFonts w:eastAsia="Times New Roman" w:cstheme="minorHAnsi"/>
-                <w:color w:val="000000"/>
-                <w:sz w:val="20"/>
-                <w:szCs w:val="20"/>
-                <w:lang w:eastAsia="en-PH"/>
-              </w:rPr>
-              <w:t>Network security</w:t>
-            </w:r>
-          </w:p>
-        </w:tc>
-        <w:tc>
-          <w:tcPr>
-            <w:tcW w:w="2126" w:type="dxa"/>
+          </w:p>
+        </w:tc>
+        <w:tc>
+          <w:tcPr>
+            <w:tcW w:w="2693" w:type="dxa"/>
             <w:tcBorders>
               <w:top w:val="nil"/>
               <w:left w:val="nil"/>
@@ -2460,13 +1698,14 @@
             </w:tcBorders>
             <w:noWrap/>
             <w:vAlign w:val="bottom"/>
-            <w:hideMark/>
-          </w:tcPr>
-          <w:p>
-            <w:pPr>
-              <w:spacing w:after="0" w:line="240" w:lineRule="auto"/>
-              <w:rPr>
-                <w:rFonts w:eastAsia="Times New Roman" w:cstheme="minorHAnsi"/>
+          </w:tcPr>
+          <w:p>
+            <w:pPr>
+              <w:spacing w:after="0" w:line="240" w:lineRule="auto"/>
+              <w:rPr>
+                <w:rFonts w:eastAsia="Times New Roman" w:cstheme="minorHAnsi"/>
+                <w:b/>
+                <w:bCs/>
                 <w:color w:val="000000"/>
                 <w:sz w:val="20"/>
                 <w:szCs w:val="20"/>
@@ -2476,18 +1715,20 @@
             <w:r>
               <w:rPr>
                 <w:rFonts w:eastAsia="Times New Roman" w:cstheme="minorHAnsi"/>
-                <w:color w:val="000000"/>
-                <w:sz w:val="20"/>
-                <w:szCs w:val="20"/>
-                <w:lang w:eastAsia="en-PH"/>
-              </w:rPr>
-              <w:t>PST</w:t>
+                <w:b/>
+                <w:bCs/>
+                <w:color w:val="000000"/>
+                <w:sz w:val="20"/>
+                <w:szCs w:val="20"/>
+                <w:lang w:eastAsia="en-PH"/>
+              </w:rPr>
+              <w:t>IT Setup</w:t>
             </w:r>
           </w:p>
         </w:tc>
         <w:tc>
           <w:tcPr>
-            <w:tcW w:w="3126" w:type="dxa"/>
+            <w:tcW w:w="2559" w:type="dxa"/>
             <w:tcBorders>
               <w:top w:val="nil"/>
               <w:left w:val="nil"/>
@@ -2508,16 +1749,6 @@
                 <w:lang w:eastAsia="en-PH"/>
               </w:rPr>
             </w:pPr>
-            <w:r>
-              <w:rPr>
-                <w:rFonts w:eastAsia="Times New Roman" w:cstheme="minorHAnsi"/>
-                <w:color w:val="000000"/>
-                <w:sz w:val="20"/>
-                <w:szCs w:val="20"/>
-                <w:lang w:eastAsia="en-PH"/>
-              </w:rPr>
-              <w:t>6/5/23 – 6/14/23</w:t>
-            </w:r>
           </w:p>
         </w:tc>
         <w:tc>
@@ -2545,7 +1776,7 @@
         </w:trPr>
         <w:tc>
           <w:tcPr>
-            <w:tcW w:w="2515" w:type="dxa"/>
+            <w:tcW w:w="2405" w:type="dxa"/>
             <w:tcBorders>
               <w:top w:val="nil"/>
               <w:left w:val="single" w:sz="4" w:space="0" w:color="auto"/>
@@ -2570,7 +1801,7 @@
         </w:tc>
         <w:tc>
           <w:tcPr>
-            <w:tcW w:w="2442" w:type="dxa"/>
+            <w:tcW w:w="2552" w:type="dxa"/>
             <w:tcBorders>
               <w:top w:val="nil"/>
               <w:left w:val="nil"/>
@@ -2592,21 +1823,11 @@
                 <w:lang w:eastAsia="en-PH"/>
               </w:rPr>
             </w:pPr>
-            <w:r>
-              <w:rPr>
-                <w:rFonts w:eastAsia="Times New Roman" w:cstheme="minorHAnsi"/>
-                <w:color w:val="000000"/>
-                <w:sz w:val="20"/>
-                <w:szCs w:val="20"/>
-                <w:lang w:eastAsia="en-PH"/>
-              </w:rPr>
-              <w:t>Server</w:t>
-            </w:r>
-          </w:p>
-        </w:tc>
-        <w:tc>
-          <w:tcPr>
-            <w:tcW w:w="2126" w:type="dxa"/>
+          </w:p>
+        </w:tc>
+        <w:tc>
+          <w:tcPr>
+            <w:tcW w:w="2693" w:type="dxa"/>
             <w:tcBorders>
               <w:top w:val="nil"/>
               <w:left w:val="nil"/>
@@ -2615,13 +1836,14 @@
             </w:tcBorders>
             <w:noWrap/>
             <w:vAlign w:val="bottom"/>
-            <w:hideMark/>
-          </w:tcPr>
-          <w:p>
-            <w:pPr>
-              <w:spacing w:after="0" w:line="240" w:lineRule="auto"/>
-              <w:rPr>
-                <w:rFonts w:eastAsia="Times New Roman" w:cstheme="minorHAnsi"/>
+          </w:tcPr>
+          <w:p>
+            <w:pPr>
+              <w:spacing w:after="0" w:line="240" w:lineRule="auto"/>
+              <w:rPr>
+                <w:rFonts w:eastAsia="Times New Roman" w:cstheme="minorHAnsi"/>
+                <w:b/>
+                <w:bCs/>
                 <w:color w:val="000000"/>
                 <w:sz w:val="20"/>
                 <w:szCs w:val="20"/>
@@ -2631,18 +1853,20 @@
             <w:r>
               <w:rPr>
                 <w:rFonts w:eastAsia="Times New Roman" w:cstheme="minorHAnsi"/>
-                <w:color w:val="000000"/>
-                <w:sz w:val="20"/>
-                <w:szCs w:val="20"/>
-                <w:lang w:eastAsia="en-PH"/>
-              </w:rPr>
-              <w:t>Go Live</w:t>
+                <w:b/>
+                <w:bCs/>
+                <w:color w:val="000000"/>
+                <w:sz w:val="20"/>
+                <w:szCs w:val="20"/>
+                <w:lang w:eastAsia="en-PH"/>
+              </w:rPr>
+              <w:t>UAT</w:t>
             </w:r>
           </w:p>
         </w:tc>
         <w:tc>
           <w:tcPr>
-            <w:tcW w:w="3126" w:type="dxa"/>
+            <w:tcW w:w="2559" w:type="dxa"/>
             <w:tcBorders>
               <w:top w:val="nil"/>
               <w:left w:val="nil"/>
@@ -2663,16 +1887,6 @@
                 <w:lang w:eastAsia="en-PH"/>
               </w:rPr>
             </w:pPr>
-            <w:r>
-              <w:rPr>
-                <w:rFonts w:eastAsia="Times New Roman" w:cstheme="minorHAnsi"/>
-                <w:color w:val="000000"/>
-                <w:sz w:val="20"/>
-                <w:szCs w:val="20"/>
-                <w:lang w:eastAsia="en-PH"/>
-              </w:rPr>
-              <w:t>6/15/23</w:t>
-            </w:r>
           </w:p>
         </w:tc>
         <w:tc>
@@ -2700,7 +1914,7 @@
         </w:trPr>
         <w:tc>
           <w:tcPr>
-            <w:tcW w:w="2515" w:type="dxa"/>
+            <w:tcW w:w="2405" w:type="dxa"/>
             <w:tcBorders>
               <w:top w:val="nil"/>
               <w:left w:val="single" w:sz="4" w:space="0" w:color="auto"/>
@@ -2725,7 +1939,7 @@
         </w:tc>
         <w:tc>
           <w:tcPr>
-            <w:tcW w:w="2442" w:type="dxa"/>
+            <w:tcW w:w="2552" w:type="dxa"/>
             <w:tcBorders>
               <w:top w:val="nil"/>
               <w:left w:val="nil"/>
@@ -2747,21 +1961,50 @@
                 <w:lang w:eastAsia="en-PH"/>
               </w:rPr>
             </w:pPr>
+          </w:p>
+        </w:tc>
+        <w:tc>
+          <w:tcPr>
+            <w:tcW w:w="2693" w:type="dxa"/>
+            <w:tcBorders>
+              <w:top w:val="nil"/>
+              <w:left w:val="nil"/>
+              <w:bottom w:val="single" w:sz="4" w:space="0" w:color="auto"/>
+              <w:right w:val="single" w:sz="4" w:space="0" w:color="auto"/>
+            </w:tcBorders>
+            <w:noWrap/>
+            <w:vAlign w:val="bottom"/>
+          </w:tcPr>
+          <w:p>
+            <w:pPr>
+              <w:spacing w:after="0" w:line="240" w:lineRule="auto"/>
+              <w:rPr>
+                <w:rFonts w:eastAsia="Times New Roman" w:cstheme="minorHAnsi"/>
+                <w:b/>
+                <w:bCs/>
+                <w:color w:val="000000"/>
+                <w:sz w:val="20"/>
+                <w:szCs w:val="20"/>
+                <w:lang w:eastAsia="en-PH"/>
+              </w:rPr>
+            </w:pPr>
             <w:r>
               <w:rPr>
                 <w:rFonts w:eastAsia="Times New Roman" w:cstheme="minorHAnsi"/>
-                <w:color w:val="000000"/>
-                <w:sz w:val="20"/>
-                <w:szCs w:val="20"/>
-                <w:lang w:eastAsia="en-PH"/>
-              </w:rPr>
-              <w:t>Voice</w:t>
+                <w:b/>
+                <w:bCs/>
+                <w:color w:val="000000"/>
+                <w:sz w:val="20"/>
+                <w:szCs w:val="20"/>
+                <w:lang w:eastAsia="en-PH"/>
+              </w:rPr>
+              <w:t>Train-the-Trainer</w:t>
             </w:r>
           </w:p>
         </w:tc>
         <w:tc>
           <w:tcPr>
-            <w:tcW w:w="2126" w:type="dxa"/>
+            <w:tcW w:w="2559" w:type="dxa"/>
             <w:tcBorders>
               <w:top w:val="nil"/>
               <w:left w:val="nil"/>
@@ -2783,52 +2026,6 @@
                 <w:lang w:eastAsia="en-PH"/>
               </w:rPr>
             </w:pPr>
-            <w:r>
-              <w:rPr>
-                <w:rFonts w:eastAsia="Times New Roman" w:cstheme="minorHAnsi"/>
-                <w:color w:val="000000"/>
-                <w:sz w:val="20"/>
-                <w:szCs w:val="20"/>
-                <w:lang w:eastAsia="en-PH"/>
-              </w:rPr>
-              <w:t> </w:t>
-            </w:r>
-          </w:p>
-        </w:tc>
-        <w:tc>
-          <w:tcPr>
-            <w:tcW w:w="3126" w:type="dxa"/>
-            <w:tcBorders>
-              <w:top w:val="nil"/>
-              <w:left w:val="nil"/>
-              <w:bottom w:val="single" w:sz="4" w:space="0" w:color="auto"/>
-              <w:right w:val="single" w:sz="4" w:space="0" w:color="auto"/>
-            </w:tcBorders>
-            <w:noWrap/>
-            <w:vAlign w:val="bottom"/>
-            <w:hideMark/>
-          </w:tcPr>
-          <w:p>
-            <w:pPr>
-              <w:spacing w:after="0" w:line="240" w:lineRule="auto"/>
-              <w:rPr>
-                <w:rFonts w:eastAsia="Times New Roman" w:cstheme="minorHAnsi"/>
-                <w:color w:val="000000"/>
-                <w:sz w:val="20"/>
-                <w:szCs w:val="20"/>
-                <w:lang w:eastAsia="en-PH"/>
-              </w:rPr>
-            </w:pPr>
-            <w:r>
-              <w:rPr>
-                <w:rFonts w:eastAsia="Times New Roman" w:cstheme="minorHAnsi"/>
-                <w:color w:val="000000"/>
-                <w:sz w:val="20"/>
-                <w:szCs w:val="20"/>
-                <w:lang w:eastAsia="en-PH"/>
-              </w:rPr>
-              <w:t> </w:t>
-            </w:r>
           </w:p>
         </w:tc>
         <w:tc>
@@ -2856,7 +2053,7 @@
         </w:trPr>
         <w:tc>
           <w:tcPr>
-            <w:tcW w:w="2515" w:type="dxa"/>
+            <w:tcW w:w="2405" w:type="dxa"/>
             <w:tcBorders>
               <w:top w:val="nil"/>
               <w:left w:val="single" w:sz="4" w:space="0" w:color="auto"/>
@@ -2881,7 +2078,7 @@
         </w:tc>
         <w:tc>
           <w:tcPr>
-            <w:tcW w:w="2442" w:type="dxa"/>
+            <w:tcW w:w="2552" w:type="dxa"/>
             <w:tcBorders>
               <w:top w:val="nil"/>
               <w:left w:val="nil"/>
@@ -2903,21 +2100,50 @@
                 <w:lang w:eastAsia="en-PH"/>
               </w:rPr>
             </w:pPr>
+          </w:p>
+        </w:tc>
+        <w:tc>
+          <w:tcPr>
+            <w:tcW w:w="2693" w:type="dxa"/>
+            <w:tcBorders>
+              <w:top w:val="nil"/>
+              <w:left w:val="nil"/>
+              <w:bottom w:val="single" w:sz="4" w:space="0" w:color="auto"/>
+              <w:right w:val="single" w:sz="4" w:space="0" w:color="auto"/>
+            </w:tcBorders>
+            <w:noWrap/>
+            <w:vAlign w:val="bottom"/>
+          </w:tcPr>
+          <w:p>
+            <w:pPr>
+              <w:spacing w:after="0" w:line="240" w:lineRule="auto"/>
+              <w:rPr>
+                <w:rFonts w:eastAsia="Times New Roman" w:cstheme="minorHAnsi"/>
+                <w:b/>
+                <w:bCs/>
+                <w:color w:val="000000"/>
+                <w:sz w:val="20"/>
+                <w:szCs w:val="20"/>
+                <w:lang w:eastAsia="en-PH"/>
+              </w:rPr>
+            </w:pPr>
             <w:r>
               <w:rPr>
                 <w:rFonts w:eastAsia="Times New Roman" w:cstheme="minorHAnsi"/>
-                <w:color w:val="000000"/>
-                <w:sz w:val="20"/>
-                <w:szCs w:val="20"/>
-                <w:lang w:eastAsia="en-PH"/>
-              </w:rPr>
-              <w:t>Desktop Engr</w:t>
+                <w:b/>
+                <w:bCs/>
+                <w:color w:val="000000"/>
+                <w:sz w:val="20"/>
+                <w:szCs w:val="20"/>
+                <w:lang w:eastAsia="en-PH"/>
+              </w:rPr>
+              <w:t>CET</w:t>
             </w:r>
           </w:p>
         </w:tc>
         <w:tc>
           <w:tcPr>
-            <w:tcW w:w="2126" w:type="dxa"/>
+            <w:tcW w:w="2559" w:type="dxa"/>
             <w:tcBorders>
               <w:top w:val="nil"/>
               <w:left w:val="nil"/>
@@ -2939,102 +2165,6 @@
                 <w:lang w:eastAsia="en-PH"/>
               </w:rPr>
             </w:pPr>
-            <w:r>
-              <w:rPr>
-                <w:rFonts w:eastAsia="Times New Roman" w:cstheme="minorHAnsi"/>
-                <w:color w:val="000000"/>
-                <w:sz w:val="20"/>
-                <w:szCs w:val="20"/>
-                <w:lang w:eastAsia="en-PH"/>
-              </w:rPr>
-              <w:t>Kick off</w:t>
-            </w:r>
-          </w:p>
-        </w:tc>
-        <w:tc>
-          <w:tcPr>
-            <w:tcW w:w="3126" w:type="dxa"/>
-            <w:tcBorders>
-              <w:top w:val="nil"/>
-              <w:left w:val="nil"/>
-              <w:bottom w:val="single" w:sz="4" w:space="0" w:color="auto"/>
-              <w:right w:val="single" w:sz="4" w:space="0" w:color="auto"/>
-            </w:tcBorders>
-            <w:noWrap/>
-            <w:vAlign w:val="bottom"/>
-            <w:hideMark/>
-          </w:tcPr>
-          <w:p>
-            <w:pPr>
-              <w:spacing w:after="0" w:line="240" w:lineRule="auto"/>
-              <w:rPr>
-                <w:rFonts w:eastAsia="Times New Roman" w:cstheme="minorHAnsi"/>
-                <w:color w:val="000000"/>
-                <w:sz w:val="20"/>
-                <w:szCs w:val="20"/>
-                <w:lang w:eastAsia="en-PH"/>
-              </w:rPr>
-            </w:pPr>
-            <w:r>
-              <w:rPr>
-                <w:rFonts w:eastAsia="Times New Roman" w:cstheme="minorHAnsi"/>
-                <w:color w:val="000000"/>
-                <w:sz w:val="20"/>
-                <w:szCs w:val="20"/>
-                <w:lang w:eastAsia="en-PH"/>
-              </w:rPr>
-              <w:t> </w:t>
-            </w:r>
-            <w:r>
-              <w:rPr>
-                <w:rFonts w:eastAsia="Times New Roman" w:cstheme="minorHAnsi"/>
-                <w:color w:val="000000"/>
-                <w:sz w:val="20"/>
-                <w:szCs w:val="20"/>
-                <w:lang w:eastAsia="en-PH"/>
-              </w:rPr>
-              <w:t>0</w:t>
-            </w:r>
-            <w:r>
-              <w:rPr>
-                <w:rFonts w:eastAsia="Times New Roman" w:cstheme="minorHAnsi"/>
-                <w:color w:val="000000"/>
-                <w:sz w:val="20"/>
-                <w:szCs w:val="20"/>
-                <w:lang w:eastAsia="en-PH"/>
-              </w:rPr>
-              <w:t>4</w:t>
-            </w:r>
-            <w:r>
-              <w:rPr>
-                <w:rFonts w:eastAsia="Times New Roman" w:cstheme="minorHAnsi"/>
-                <w:color w:val="000000"/>
-                <w:sz w:val="20"/>
-                <w:szCs w:val="20"/>
-                <w:lang w:eastAsia="en-PH"/>
-              </w:rPr>
-              <w:t>/</w:t>
-            </w:r>
-            <w:r>
-              <w:rPr>
-                <w:rFonts w:eastAsia="Times New Roman" w:cstheme="minorHAnsi"/>
-                <w:color w:val="000000"/>
-                <w:sz w:val="20"/>
-                <w:szCs w:val="20"/>
-                <w:lang w:eastAsia="en-PH"/>
-              </w:rPr>
-              <w:t>31</w:t>
-            </w:r>
-            <w:r>
-              <w:rPr>
-                <w:rFonts w:eastAsia="Times New Roman" w:cstheme="minorHAnsi"/>
-                <w:color w:val="000000"/>
-                <w:sz w:val="20"/>
-                <w:szCs w:val="20"/>
-                <w:lang w:eastAsia="en-PH"/>
-              </w:rPr>
-              <w:t>/2023</w:t>
-            </w:r>
           </w:p>
         </w:tc>
         <w:tc>
@@ -3062,7 +2192,7 @@
         </w:trPr>
         <w:tc>
           <w:tcPr>
-            <w:tcW w:w="2515" w:type="dxa"/>
+            <w:tcW w:w="2405" w:type="dxa"/>
             <w:tcBorders>
               <w:top w:val="nil"/>
               <w:left w:val="single" w:sz="4" w:space="0" w:color="auto"/>
@@ -3087,7 +2217,7 @@
         </w:tc>
         <w:tc>
           <w:tcPr>
-            <w:tcW w:w="2442" w:type="dxa"/>
+            <w:tcW w:w="2552" w:type="dxa"/>
             <w:tcBorders>
               <w:top w:val="nil"/>
               <w:left w:val="nil"/>
@@ -3109,41 +2239,50 @@
                 <w:lang w:eastAsia="en-PH"/>
               </w:rPr>
             </w:pPr>
+          </w:p>
+        </w:tc>
+        <w:tc>
+          <w:tcPr>
+            <w:tcW w:w="2693" w:type="dxa"/>
+            <w:tcBorders>
+              <w:top w:val="nil"/>
+              <w:left w:val="nil"/>
+              <w:bottom w:val="single" w:sz="4" w:space="0" w:color="auto"/>
+              <w:right w:val="single" w:sz="4" w:space="0" w:color="auto"/>
+            </w:tcBorders>
+            <w:noWrap/>
+            <w:vAlign w:val="bottom"/>
+          </w:tcPr>
+          <w:p>
+            <w:pPr>
+              <w:spacing w:after="0" w:line="240" w:lineRule="auto"/>
+              <w:rPr>
+                <w:rFonts w:eastAsia="Times New Roman" w:cstheme="minorHAnsi"/>
+                <w:b/>
+                <w:bCs/>
+                <w:color w:val="000000"/>
+                <w:sz w:val="20"/>
+                <w:szCs w:val="20"/>
+                <w:lang w:eastAsia="en-PH"/>
+              </w:rPr>
+            </w:pPr>
             <w:r>
               <w:rPr>
                 <w:rFonts w:eastAsia="Times New Roman" w:cstheme="minorHAnsi"/>
-                <w:color w:val="000000"/>
-                <w:sz w:val="20"/>
-                <w:szCs w:val="20"/>
-                <w:lang w:eastAsia="en-PH"/>
-              </w:rPr>
-              <w:t>IT</w:t>
+                <w:b/>
+                <w:bCs/>
+                <w:color w:val="000000"/>
+                <w:sz w:val="20"/>
+                <w:szCs w:val="20"/>
+                <w:lang w:eastAsia="en-PH"/>
+              </w:rPr>
+              <w:t>PST</w:t>
             </w:r>
-            <w:r>
-              <w:rPr>
-                <w:rFonts w:eastAsia="Times New Roman" w:cstheme="minorHAnsi"/>
-                <w:color w:val="000000"/>
-                <w:sz w:val="20"/>
-                <w:szCs w:val="20"/>
-                <w:lang w:eastAsia="en-PH"/>
-              </w:rPr>
-              <w:t xml:space="preserve"> </w:t>
-            </w:r>
-            <w:r>
-              <w:rPr>
-                <w:rFonts w:eastAsia="Times New Roman" w:cstheme="minorHAnsi"/>
-                <w:color w:val="000000"/>
-                <w:sz w:val="20"/>
-                <w:szCs w:val="20"/>
-                <w:lang w:eastAsia="en-PH"/>
-              </w:rPr>
-              <w:t>Ops</w:t>
-            </w:r>
-          </w:p>
-        </w:tc>
-        <w:tc>
-          <w:tcPr>
-            <w:tcW w:w="2126" w:type="dxa"/>
+          </w:p>
+        </w:tc>
+        <w:tc>
+          <w:tcPr>
+            <w:tcW w:w="2559" w:type="dxa"/>
             <w:tcBorders>
               <w:top w:val="nil"/>
               <w:left w:val="nil"/>
@@ -3165,72 +2304,6 @@
                 <w:lang w:eastAsia="en-PH"/>
               </w:rPr>
             </w:pPr>
-            <w:r>
-              <w:rPr>
-                <w:rFonts w:eastAsia="Times New Roman" w:cstheme="minorHAnsi"/>
-                <w:color w:val="000000"/>
-                <w:sz w:val="20"/>
-                <w:szCs w:val="20"/>
-                <w:lang w:eastAsia="en-PH"/>
-              </w:rPr>
-              <w:t>Asset allocation</w:t>
-            </w:r>
-          </w:p>
-        </w:tc>
-        <w:tc>
-          <w:tcPr>
-            <w:tcW w:w="3126" w:type="dxa"/>
-            <w:tcBorders>
-              <w:top w:val="nil"/>
-              <w:left w:val="nil"/>
-              <w:bottom w:val="single" w:sz="4" w:space="0" w:color="auto"/>
-              <w:right w:val="single" w:sz="4" w:space="0" w:color="auto"/>
-            </w:tcBorders>
-            <w:noWrap/>
-            <w:vAlign w:val="bottom"/>
-            <w:hideMark/>
-          </w:tcPr>
-          <w:p>
-            <w:pPr>
-              <w:spacing w:after="0" w:line="240" w:lineRule="auto"/>
-              <w:rPr>
-                <w:rFonts w:eastAsia="Times New Roman" w:cstheme="minorHAnsi"/>
-                <w:color w:val="000000"/>
-                <w:sz w:val="20"/>
-                <w:szCs w:val="20"/>
-                <w:lang w:eastAsia="en-PH"/>
-              </w:rPr>
-            </w:pPr>
-            <w:r>
-              <w:rPr>
-                <w:rFonts w:eastAsia="Times New Roman" w:cstheme="minorHAnsi"/>
-                <w:color w:val="000000"/>
-                <w:sz w:val="20"/>
-                <w:szCs w:val="20"/>
-                <w:lang w:eastAsia="en-PH"/>
-              </w:rPr>
-              <w:t> </w:t>
-            </w:r>
-            <w:r>
-              <w:rPr>
-                <w:rFonts w:eastAsia="Times New Roman" w:cstheme="minorHAnsi"/>
-                <w:color w:val="000000"/>
-                <w:sz w:val="20"/>
-                <w:szCs w:val="20"/>
-                <w:lang w:eastAsia="en-PH"/>
-              </w:rPr>
-              <w:t> </w:t>
-            </w:r>
-            <w:r>
-              <w:rPr>
-                <w:rFonts w:eastAsia="Times New Roman" w:cstheme="minorHAnsi"/>
-                <w:color w:val="000000"/>
-                <w:sz w:val="20"/>
-                <w:szCs w:val="20"/>
-                <w:lang w:eastAsia="en-PH"/>
-              </w:rPr>
-              <w:t>SRC34490</w:t>
-            </w:r>
           </w:p>
         </w:tc>
         <w:tc>
@@ -3258,7 +2331,7 @@
         </w:trPr>
         <w:tc>
           <w:tcPr>
-            <w:tcW w:w="2515" w:type="dxa"/>
+            <w:tcW w:w="2405" w:type="dxa"/>
             <w:tcBorders>
               <w:top w:val="nil"/>
               <w:left w:val="single" w:sz="4" w:space="0" w:color="auto"/>
@@ -3283,7 +2356,7 @@
         </w:tc>
         <w:tc>
           <w:tcPr>
-            <w:tcW w:w="2442" w:type="dxa"/>
+            <w:tcW w:w="2552" w:type="dxa"/>
             <w:tcBorders>
               <w:top w:val="nil"/>
               <w:left w:val="nil"/>
@@ -3305,21 +2378,11 @@
                 <w:lang w:eastAsia="en-PH"/>
               </w:rPr>
             </w:pPr>
-            <w:r>
-              <w:rPr>
-                <w:rFonts w:eastAsia="Times New Roman" w:cstheme="minorHAnsi"/>
-                <w:color w:val="000000"/>
-                <w:sz w:val="20"/>
-                <w:szCs w:val="20"/>
-                <w:lang w:eastAsia="en-PH"/>
-              </w:rPr>
-              <w:t>IT SEC</w:t>
-            </w:r>
-          </w:p>
-        </w:tc>
-        <w:tc>
-          <w:tcPr>
-            <w:tcW w:w="2126" w:type="dxa"/>
+          </w:p>
+        </w:tc>
+        <w:tc>
+          <w:tcPr>
+            <w:tcW w:w="2693" w:type="dxa"/>
             <w:tcBorders>
               <w:top w:val="nil"/>
               <w:left w:val="nil"/>
@@ -3335,6 +2398,8 @@
               <w:spacing w:after="0" w:line="240" w:lineRule="auto"/>
               <w:rPr>
                 <w:rFonts w:eastAsia="Times New Roman" w:cstheme="minorHAnsi"/>
+                <w:b/>
+                <w:bCs/>
                 <w:color w:val="000000"/>
                 <w:sz w:val="20"/>
                 <w:szCs w:val="20"/>
@@ -3344,18 +2409,20 @@
             <w:r>
               <w:rPr>
                 <w:rFonts w:eastAsia="Times New Roman" w:cstheme="minorHAnsi"/>
-                <w:color w:val="000000"/>
-                <w:sz w:val="20"/>
-                <w:szCs w:val="20"/>
-                <w:lang w:eastAsia="en-PH"/>
-              </w:rPr>
-              <w:t>Procurement</w:t>
+                <w:b/>
+                <w:bCs/>
+                <w:color w:val="000000"/>
+                <w:sz w:val="20"/>
+                <w:szCs w:val="20"/>
+                <w:lang w:eastAsia="en-PH"/>
+              </w:rPr>
+              <w:t>Go-Live</w:t>
             </w:r>
           </w:p>
         </w:tc>
         <w:tc>
           <w:tcPr>
-            <w:tcW w:w="3126" w:type="dxa"/>
+            <w:tcW w:w="2559" w:type="dxa"/>
             <w:tcBorders>
               <w:top w:val="nil"/>
               <w:left w:val="nil"/>
@@ -3377,26 +2444,6 @@
                 <w:lang w:eastAsia="en-PH"/>
               </w:rPr>
             </w:pPr>
-            <w:r>
-              <w:rPr>
-                <w:rFonts w:eastAsia="Times New Roman" w:cstheme="minorHAnsi"/>
-                <w:color w:val="000000"/>
-                <w:sz w:val="20"/>
-                <w:szCs w:val="20"/>
-                <w:lang w:eastAsia="en-PH"/>
-              </w:rPr>
-              <w:t> </w:t>
-            </w:r>
-            <w:r>
-              <w:rPr>
-                <w:rFonts w:eastAsia="Times New Roman" w:cstheme="minorHAnsi"/>
-                <w:color w:val="000000"/>
-                <w:sz w:val="20"/>
-                <w:szCs w:val="20"/>
-                <w:lang w:eastAsia="en-PH"/>
-              </w:rPr>
-              <w:t>N/A</w:t>
-            </w:r>
           </w:p>
         </w:tc>
         <w:tc>
@@ -3420,6 +2467,8 @@
       </w:tr>
       <w:tr>
         <w:trPr>
+          <w:gridAfter w:val="1"/>
+          <w:wAfter w:w="222" w:type="dxa"/>
           <w:trHeight w:val="290"/>
         </w:trPr>
         <w:tc>
@@ -3427,19 +2476,27 @@
             <w:tcW w:w="4957" w:type="dxa"/>
             <w:gridSpan w:val="2"/>
             <w:tcBorders>
-              <w:top w:val="single" w:sz="4" w:space="0" w:color="auto"/>
+              <w:top w:val="nil"/>
               <w:left w:val="single" w:sz="4" w:space="0" w:color="auto"/>
               <w:bottom w:val="single" w:sz="4" w:space="0" w:color="auto"/>
               <w:right w:val="single" w:sz="4" w:space="0" w:color="auto"/>
             </w:tcBorders>
             <w:noWrap/>
             <w:vAlign w:val="center"/>
-            <w:hideMark/>
           </w:tcPr>
           <w:p>
             <w:pPr>
               <w:spacing w:after="0" w:line="240" w:lineRule="auto"/>
               <w:jc w:val="center"/>
+              <w:rPr>
+                <w:rFonts w:eastAsia="Times New Roman" w:cstheme="minorHAnsi"/>
+                <w:color w:val="000000"/>
+                <w:sz w:val="20"/>
+                <w:szCs w:val="20"/>
+                <w:lang w:eastAsia="en-PH"/>
+              </w:rPr>
+            </w:pPr>
+            <w:r>
               <w:rPr>
                 <w:rFonts w:eastAsia="Times New Roman" w:cstheme="minorHAnsi"/>
                 <w:b/>
@@ -3449,36 +2506,14 @@
                 <w:szCs w:val="20"/>
                 <w:lang w:eastAsia="en-PH"/>
               </w:rPr>
-            </w:pPr>
-            <w:r>
-              <w:rPr>
-                <w:rFonts w:eastAsia="Times New Roman" w:cstheme="minorHAnsi"/>
-                <w:b/>
-                <w:bCs/>
-                <w:color w:val="000000"/>
-                <w:sz w:val="20"/>
-                <w:szCs w:val="20"/>
-                <w:lang w:eastAsia="en-PH"/>
-              </w:rPr>
               <w:t>Identified Risks</w:t>
             </w:r>
-            <w:r>
-              <w:rPr>
-                <w:rFonts w:eastAsia="Times New Roman" w:cstheme="minorHAnsi"/>
-                <w:b/>
-                <w:bCs/>
-                <w:color w:val="000000"/>
-                <w:sz w:val="20"/>
-                <w:szCs w:val="20"/>
-                <w:lang w:eastAsia="en-PH"/>
-              </w:rPr>
-              <w:t xml:space="preserve"> and Mitigation</w:t>
-            </w:r>
-          </w:p>
-        </w:tc>
-        <w:tc>
-          <w:tcPr>
-            <w:tcW w:w="2126" w:type="dxa"/>
+          </w:p>
+        </w:tc>
+        <w:tc>
+          <w:tcPr>
+            <w:tcW w:w="5252" w:type="dxa"/>
+            <w:gridSpan w:val="2"/>
             <w:tcBorders>
               <w:top w:val="nil"/>
               <w:left w:val="nil"/>
@@ -3492,8 +2527,11 @@
           <w:p>
             <w:pPr>
               <w:spacing w:after="0" w:line="240" w:lineRule="auto"/>
-              <w:rPr>
-                <w:rFonts w:eastAsia="Times New Roman" w:cstheme="minorHAnsi"/>
+              <w:jc w:val="center"/>
+              <w:rPr>
+                <w:rFonts w:eastAsia="Times New Roman" w:cstheme="minorHAnsi"/>
+                <w:b/>
+                <w:bCs/>
                 <w:color w:val="000000"/>
                 <w:sz w:val="20"/>
                 <w:szCs w:val="20"/>
@@ -3503,81 +2541,57 @@
             <w:r>
               <w:rPr>
                 <w:rFonts w:eastAsia="Times New Roman" w:cstheme="minorHAnsi"/>
-                <w:color w:val="000000"/>
-                <w:sz w:val="20"/>
-                <w:szCs w:val="20"/>
-                <w:lang w:eastAsia="en-PH"/>
-              </w:rPr>
-              <w:t>Network setup</w:t>
+                <w:b/>
+                <w:bCs/>
+                <w:color w:val="000000"/>
+                <w:sz w:val="20"/>
+                <w:szCs w:val="20"/>
+                <w:lang w:eastAsia="en-PH"/>
+              </w:rPr>
+              <w:t>Mitigation Plan</w:t>
             </w:r>
-          </w:p>
-        </w:tc>
-        <w:tc>
-          <w:tcPr>
-            <w:tcW w:w="3126" w:type="dxa"/>
-            <w:tcBorders>
-              <w:top w:val="nil"/>
-              <w:left w:val="nil"/>
-              <w:bottom w:val="single" w:sz="4" w:space="0" w:color="auto"/>
-              <w:right w:val="single" w:sz="4" w:space="0" w:color="auto"/>
-            </w:tcBorders>
-            <w:noWrap/>
-            <w:vAlign w:val="bottom"/>
-          </w:tcPr>
-          <w:p>
-            <w:pPr>
-              <w:spacing w:after="0" w:line="240" w:lineRule="auto"/>
-              <w:rPr>
-                <w:rFonts w:eastAsia="Times New Roman" w:cstheme="minorHAnsi"/>
-                <w:color w:val="000000"/>
-                <w:sz w:val="20"/>
-                <w:szCs w:val="20"/>
-                <w:lang w:eastAsia="en-PH"/>
-              </w:rPr>
-            </w:pPr>
-            <w:r>
-              <w:rPr>
-                <w:rFonts w:eastAsia="Times New Roman" w:cstheme="minorHAnsi"/>
-                <w:color w:val="000000"/>
-                <w:sz w:val="20"/>
-                <w:szCs w:val="20"/>
-                <w:lang w:eastAsia="en-PH"/>
-              </w:rPr>
-              <w:t>4/25/23 – 5/12/23</w:t>
-            </w:r>
-          </w:p>
-        </w:tc>
-        <w:tc>
-          <w:tcPr>
-            <w:tcW w:w="222" w:type="dxa"/>
-            <w:vAlign w:val="center"/>
-            <w:hideMark/>
-          </w:tcPr>
-          <w:p>
-            <w:pPr>
-              <w:spacing w:after="0" w:line="240" w:lineRule="auto"/>
-              <w:rPr>
-                <w:rFonts w:eastAsia="Times New Roman" w:cstheme="minorHAnsi"/>
-                <w:sz w:val="18"/>
-                <w:szCs w:val="18"/>
-                <w:lang w:eastAsia="en-PH"/>
-              </w:rPr>
-            </w:pPr>
           </w:p>
         </w:tc>
       </w:tr>
       <w:tr>
         <w:trPr>
+          <w:gridAfter w:val="1"/>
+          <w:wAfter w:w="222" w:type="dxa"/>
           <w:trHeight w:val="290"/>
         </w:trPr>
         <w:tc>
           <w:tcPr>
             <w:tcW w:w="4957" w:type="dxa"/>
             <w:gridSpan w:val="2"/>
-            <w:vMerge w:val="restart"/>
-            <w:tcBorders>
-              <w:top w:val="single" w:sz="4" w:space="0" w:color="auto"/>
+            <w:tcBorders>
+              <w:top w:val="nil"/>
               <w:left w:val="single" w:sz="4" w:space="0" w:color="auto"/>
+              <w:bottom w:val="single" w:sz="4" w:space="0" w:color="auto"/>
+              <w:right w:val="single" w:sz="4" w:space="0" w:color="auto"/>
+            </w:tcBorders>
+            <w:noWrap/>
+            <w:vAlign w:val="bottom"/>
+          </w:tcPr>
+          <w:p>
+            <w:pPr>
+              <w:spacing w:after="0" w:line="240" w:lineRule="auto"/>
+              <w:rPr>
+                <w:rFonts w:eastAsia="Times New Roman" w:cstheme="minorHAnsi"/>
+                <w:color w:val="000000"/>
+                <w:sz w:val="20"/>
+                <w:szCs w:val="20"/>
+                <w:lang w:eastAsia="en-PH"/>
+              </w:rPr>
+            </w:pPr>
+          </w:p>
+        </w:tc>
+        <w:tc>
+          <w:tcPr>
+            <w:tcW w:w="5252" w:type="dxa"/>
+            <w:gridSpan w:val="2"/>
+            <w:tcBorders>
+              <w:top w:val="nil"/>
+              <w:left w:val="nil"/>
               <w:bottom w:val="single" w:sz="4" w:space="0" w:color="auto"/>
               <w:right w:val="single" w:sz="4" w:space="0" w:color="auto"/>
             </w:tcBorders>
@@ -3590,139 +2604,51 @@
               <w:spacing w:after="0" w:line="240" w:lineRule="auto"/>
               <w:rPr>
                 <w:rFonts w:eastAsia="Times New Roman" w:cstheme="minorHAnsi"/>
-                <w:color w:val="EE0000"/>
-                <w:sz w:val="20"/>
-                <w:szCs w:val="20"/>
-                <w:lang w:eastAsia="en-PH"/>
-              </w:rPr>
-            </w:pPr>
-            <w:r>
-              <w:rPr>
-                <w:rFonts w:eastAsia="Times New Roman" w:cstheme="minorHAnsi"/>
-                <w:color w:val="EE0000"/>
-                <w:sz w:val="20"/>
-                <w:szCs w:val="20"/>
-                <w:lang w:eastAsia="en-PH"/>
-              </w:rPr>
-              <w:t>(sample only)</w:t>
-            </w:r>
-          </w:p>
-          <w:p>
-            <w:pPr>
-              <w:spacing w:after="0" w:line="240" w:lineRule="auto"/>
-              <w:rPr>
-                <w:rFonts w:eastAsia="Times New Roman" w:cstheme="minorHAnsi"/>
-                <w:color w:val="EE0000"/>
-                <w:sz w:val="20"/>
-                <w:szCs w:val="20"/>
-                <w:lang w:eastAsia="en-PH"/>
-              </w:rPr>
-            </w:pPr>
-            <w:r>
-              <w:rPr>
-                <w:rFonts w:eastAsia="Times New Roman" w:cstheme="minorHAnsi"/>
-                <w:color w:val="EE0000"/>
-                <w:sz w:val="20"/>
-                <w:szCs w:val="20"/>
-                <w:lang w:eastAsia="en-PH"/>
-              </w:rPr>
-              <w:t>Risk:</w:t>
-            </w:r>
-          </w:p>
-          <w:p>
-            <w:pPr>
-              <w:spacing w:after="0" w:line="240" w:lineRule="auto"/>
-              <w:rPr>
-                <w:rFonts w:eastAsia="Times New Roman" w:cstheme="minorHAnsi"/>
-                <w:color w:val="EE0000"/>
-                <w:sz w:val="20"/>
-                <w:szCs w:val="20"/>
-                <w:lang w:eastAsia="en-PH"/>
-              </w:rPr>
-            </w:pPr>
-            <w:r>
-              <w:rPr>
-                <w:rFonts w:eastAsia="Times New Roman" w:cstheme="minorHAnsi"/>
-                <w:color w:val="EE0000"/>
-                <w:sz w:val="20"/>
-                <w:szCs w:val="20"/>
-                <w:lang w:eastAsia="en-PH"/>
-              </w:rPr>
-              <w:t>Mitigation:</w:t>
-            </w:r>
-          </w:p>
-          <w:p>
-            <w:pPr>
-              <w:spacing w:after="0" w:line="240" w:lineRule="auto"/>
-              <w:rPr>
-                <w:rFonts w:eastAsia="Times New Roman" w:cstheme="minorHAnsi"/>
-                <w:color w:val="EE0000"/>
-                <w:sz w:val="20"/>
-                <w:szCs w:val="20"/>
-                <w:lang w:eastAsia="en-PH"/>
-              </w:rPr>
-            </w:pPr>
-          </w:p>
-          <w:p>
-            <w:pPr>
-              <w:spacing w:after="0" w:line="240" w:lineRule="auto"/>
-              <w:rPr>
-                <w:rFonts w:eastAsia="Times New Roman" w:cstheme="minorHAnsi"/>
-                <w:color w:val="EE0000"/>
-                <w:sz w:val="20"/>
-                <w:szCs w:val="20"/>
-                <w:lang w:eastAsia="en-PH"/>
-              </w:rPr>
-            </w:pPr>
-            <w:r>
-              <w:rPr>
-                <w:rFonts w:eastAsia="Times New Roman" w:cstheme="minorHAnsi"/>
-                <w:color w:val="EE0000"/>
-                <w:sz w:val="20"/>
-                <w:szCs w:val="20"/>
-                <w:lang w:eastAsia="en-PH"/>
-              </w:rPr>
-              <w:t>Risk:</w:t>
-            </w:r>
-          </w:p>
-          <w:p>
-            <w:pPr>
-              <w:spacing w:after="0" w:line="240" w:lineRule="auto"/>
-              <w:rPr>
-                <w:rFonts w:eastAsia="Times New Roman" w:cstheme="minorHAnsi"/>
-                <w:color w:val="EE0000"/>
-                <w:sz w:val="20"/>
-                <w:szCs w:val="20"/>
-                <w:lang w:eastAsia="en-PH"/>
-              </w:rPr>
-            </w:pPr>
-            <w:r>
-              <w:rPr>
-                <w:rFonts w:eastAsia="Times New Roman" w:cstheme="minorHAnsi"/>
-                <w:color w:val="EE0000"/>
-                <w:sz w:val="20"/>
-                <w:szCs w:val="20"/>
-                <w:lang w:eastAsia="en-PH"/>
-              </w:rPr>
-              <w:t>Mitigation:</w:t>
-            </w:r>
-          </w:p>
-          <w:p>
-            <w:pPr>
-              <w:spacing w:after="0" w:line="240" w:lineRule="auto"/>
-              <w:rPr>
-                <w:rFonts w:eastAsia="Times New Roman" w:cstheme="minorHAnsi"/>
-                <w:color w:val="EE0000"/>
-                <w:sz w:val="20"/>
-                <w:szCs w:val="20"/>
-                <w:lang w:eastAsia="en-PH"/>
-              </w:rPr>
-            </w:pPr>
-          </w:p>
-        </w:tc>
-        <w:tc>
-          <w:tcPr>
-            <w:tcW w:w="2126" w:type="dxa"/>
+                <w:color w:val="000000"/>
+                <w:sz w:val="20"/>
+                <w:szCs w:val="20"/>
+                <w:lang w:eastAsia="en-PH"/>
+              </w:rPr>
+            </w:pPr>
+          </w:p>
+        </w:tc>
+      </w:tr>
+      <w:tr>
+        <w:trPr>
+          <w:gridAfter w:val="1"/>
+          <w:wAfter w:w="222" w:type="dxa"/>
+          <w:trHeight w:val="290"/>
+        </w:trPr>
+        <w:tc>
+          <w:tcPr>
+            <w:tcW w:w="4957" w:type="dxa"/>
+            <w:gridSpan w:val="2"/>
+            <w:tcBorders>
+              <w:top w:val="nil"/>
+              <w:left w:val="single" w:sz="4" w:space="0" w:color="auto"/>
+              <w:bottom w:val="single" w:sz="4" w:space="0" w:color="auto"/>
+              <w:right w:val="single" w:sz="4" w:space="0" w:color="auto"/>
+            </w:tcBorders>
+            <w:noWrap/>
+            <w:vAlign w:val="bottom"/>
+          </w:tcPr>
+          <w:p>
+            <w:pPr>
+              <w:spacing w:after="0" w:line="240" w:lineRule="auto"/>
+              <w:rPr>
+                <w:rFonts w:eastAsia="Times New Roman" w:cstheme="minorHAnsi"/>
+                <w:color w:val="000000"/>
+                <w:sz w:val="20"/>
+                <w:szCs w:val="20"/>
+                <w:lang w:eastAsia="en-PH"/>
+              </w:rPr>
+            </w:pPr>
+          </w:p>
+        </w:tc>
+        <w:tc>
+          <w:tcPr>
+            <w:tcW w:w="5252" w:type="dxa"/>
+            <w:gridSpan w:val="2"/>
             <w:tcBorders>
               <w:top w:val="nil"/>
               <w:left w:val="nil"/>
@@ -3741,554 +2667,6 @@
                 <w:color w:val="000000"/>
                 <w:sz w:val="20"/>
                 <w:szCs w:val="20"/>
-                <w:lang w:eastAsia="en-PH"/>
-              </w:rPr>
-            </w:pPr>
-            <w:r>
-              <w:rPr>
-                <w:rFonts w:eastAsia="Times New Roman" w:cstheme="minorHAnsi"/>
-                <w:color w:val="000000"/>
-                <w:sz w:val="20"/>
-                <w:szCs w:val="20"/>
-                <w:lang w:eastAsia="en-PH"/>
-              </w:rPr>
-              <w:t>Server setup</w:t>
-            </w:r>
-          </w:p>
-        </w:tc>
-        <w:tc>
-          <w:tcPr>
-            <w:tcW w:w="3126" w:type="dxa"/>
-            <w:tcBorders>
-              <w:top w:val="nil"/>
-              <w:left w:val="nil"/>
-              <w:bottom w:val="single" w:sz="4" w:space="0" w:color="auto"/>
-              <w:right w:val="single" w:sz="4" w:space="0" w:color="auto"/>
-            </w:tcBorders>
-            <w:noWrap/>
-            <w:vAlign w:val="bottom"/>
-          </w:tcPr>
-          <w:p>
-            <w:pPr>
-              <w:spacing w:after="0" w:line="240" w:lineRule="auto"/>
-              <w:rPr>
-                <w:rFonts w:eastAsia="Times New Roman" w:cstheme="minorHAnsi"/>
-                <w:color w:val="000000"/>
-                <w:sz w:val="20"/>
-                <w:szCs w:val="20"/>
-                <w:lang w:eastAsia="en-PH"/>
-              </w:rPr>
-            </w:pPr>
-            <w:r>
-              <w:rPr>
-                <w:rFonts w:eastAsia="Times New Roman" w:cstheme="minorHAnsi"/>
-                <w:color w:val="000000"/>
-                <w:sz w:val="20"/>
-                <w:szCs w:val="20"/>
-                <w:lang w:eastAsia="en-PH"/>
-              </w:rPr>
-              <w:t>4/25/23 – 5/12/23</w:t>
-            </w:r>
-          </w:p>
-        </w:tc>
-        <w:tc>
-          <w:tcPr>
-            <w:tcW w:w="222" w:type="dxa"/>
-            <w:vAlign w:val="center"/>
-            <w:hideMark/>
-          </w:tcPr>
-          <w:p>
-            <w:pPr>
-              <w:spacing w:after="0" w:line="240" w:lineRule="auto"/>
-              <w:rPr>
-                <w:rFonts w:eastAsia="Times New Roman" w:cstheme="minorHAnsi"/>
-                <w:sz w:val="18"/>
-                <w:szCs w:val="18"/>
-                <w:lang w:eastAsia="en-PH"/>
-              </w:rPr>
-            </w:pPr>
-          </w:p>
-        </w:tc>
-      </w:tr>
-      <w:tr>
-        <w:trPr>
-          <w:trHeight w:val="290"/>
-        </w:trPr>
-        <w:tc>
-          <w:tcPr>
-            <w:tcW w:w="4957" w:type="dxa"/>
-            <w:gridSpan w:val="2"/>
-            <w:vMerge/>
-            <w:tcBorders>
-              <w:top w:val="single" w:sz="4" w:space="0" w:color="auto"/>
-              <w:left w:val="single" w:sz="4" w:space="0" w:color="auto"/>
-              <w:bottom w:val="single" w:sz="4" w:space="0" w:color="auto"/>
-              <w:right w:val="single" w:sz="4" w:space="0" w:color="auto"/>
-            </w:tcBorders>
-            <w:vAlign w:val="center"/>
-            <w:hideMark/>
-          </w:tcPr>
-          <w:p>
-            <w:pPr>
-              <w:spacing w:after="0" w:line="240" w:lineRule="auto"/>
-              <w:rPr>
-                <w:rFonts w:eastAsia="Times New Roman" w:cstheme="minorHAnsi"/>
-                <w:color w:val="000000"/>
-                <w:sz w:val="20"/>
-                <w:szCs w:val="20"/>
-                <w:lang w:eastAsia="en-PH"/>
-              </w:rPr>
-            </w:pPr>
-          </w:p>
-        </w:tc>
-        <w:tc>
-          <w:tcPr>
-            <w:tcW w:w="2126" w:type="dxa"/>
-            <w:tcBorders>
-              <w:top w:val="nil"/>
-              <w:left w:val="nil"/>
-              <w:bottom w:val="single" w:sz="4" w:space="0" w:color="auto"/>
-              <w:right w:val="single" w:sz="4" w:space="0" w:color="auto"/>
-            </w:tcBorders>
-            <w:noWrap/>
-            <w:vAlign w:val="bottom"/>
-            <w:hideMark/>
-          </w:tcPr>
-          <w:p>
-            <w:pPr>
-              <w:spacing w:after="0" w:line="240" w:lineRule="auto"/>
-              <w:rPr>
-                <w:rFonts w:eastAsia="Times New Roman" w:cstheme="minorHAnsi"/>
-                <w:color w:val="000000"/>
-                <w:sz w:val="20"/>
-                <w:szCs w:val="20"/>
-                <w:lang w:eastAsia="en-PH"/>
-              </w:rPr>
-            </w:pPr>
-            <w:r>
-              <w:rPr>
-                <w:rFonts w:eastAsia="Times New Roman" w:cstheme="minorHAnsi"/>
-                <w:color w:val="000000"/>
-                <w:sz w:val="20"/>
-                <w:szCs w:val="20"/>
-                <w:lang w:eastAsia="en-PH"/>
-              </w:rPr>
-              <w:t>Voice setup</w:t>
-            </w:r>
-          </w:p>
-        </w:tc>
-        <w:tc>
-          <w:tcPr>
-            <w:tcW w:w="3126" w:type="dxa"/>
-            <w:tcBorders>
-              <w:top w:val="nil"/>
-              <w:left w:val="nil"/>
-              <w:bottom w:val="single" w:sz="4" w:space="0" w:color="auto"/>
-              <w:right w:val="single" w:sz="4" w:space="0" w:color="auto"/>
-            </w:tcBorders>
-            <w:noWrap/>
-            <w:vAlign w:val="bottom"/>
-          </w:tcPr>
-          <w:p>
-            <w:pPr>
-              <w:spacing w:after="0" w:line="240" w:lineRule="auto"/>
-              <w:rPr>
-                <w:rFonts w:eastAsia="Times New Roman" w:cstheme="minorHAnsi"/>
-                <w:color w:val="000000"/>
-                <w:sz w:val="20"/>
-                <w:szCs w:val="20"/>
-                <w:lang w:eastAsia="en-PH"/>
-              </w:rPr>
-            </w:pPr>
-            <w:r>
-              <w:rPr>
-                <w:rFonts w:eastAsia="Times New Roman" w:cstheme="minorHAnsi"/>
-                <w:color w:val="000000"/>
-                <w:sz w:val="20"/>
-                <w:szCs w:val="20"/>
-                <w:lang w:eastAsia="en-PH"/>
-              </w:rPr>
-              <w:t>5/22/23 – 6/5/23</w:t>
-            </w:r>
-          </w:p>
-        </w:tc>
-        <w:tc>
-          <w:tcPr>
-            <w:tcW w:w="222" w:type="dxa"/>
-            <w:vAlign w:val="center"/>
-            <w:hideMark/>
-          </w:tcPr>
-          <w:p>
-            <w:pPr>
-              <w:spacing w:after="0" w:line="240" w:lineRule="auto"/>
-              <w:rPr>
-                <w:rFonts w:eastAsia="Times New Roman" w:cstheme="minorHAnsi"/>
-                <w:sz w:val="18"/>
-                <w:szCs w:val="18"/>
-                <w:lang w:eastAsia="en-PH"/>
-              </w:rPr>
-            </w:pPr>
-          </w:p>
-        </w:tc>
-      </w:tr>
-      <w:tr>
-        <w:trPr>
-          <w:trHeight w:val="290"/>
-        </w:trPr>
-        <w:tc>
-          <w:tcPr>
-            <w:tcW w:w="4957" w:type="dxa"/>
-            <w:gridSpan w:val="2"/>
-            <w:vMerge/>
-            <w:tcBorders>
-              <w:top w:val="single" w:sz="4" w:space="0" w:color="auto"/>
-              <w:left w:val="single" w:sz="4" w:space="0" w:color="auto"/>
-              <w:bottom w:val="single" w:sz="4" w:space="0" w:color="auto"/>
-              <w:right w:val="single" w:sz="4" w:space="0" w:color="auto"/>
-            </w:tcBorders>
-            <w:vAlign w:val="center"/>
-            <w:hideMark/>
-          </w:tcPr>
-          <w:p>
-            <w:pPr>
-              <w:spacing w:after="0" w:line="240" w:lineRule="auto"/>
-              <w:rPr>
-                <w:rFonts w:eastAsia="Times New Roman" w:cstheme="minorHAnsi"/>
-                <w:color w:val="000000"/>
-                <w:sz w:val="20"/>
-                <w:szCs w:val="20"/>
-                <w:lang w:eastAsia="en-PH"/>
-              </w:rPr>
-            </w:pPr>
-          </w:p>
-        </w:tc>
-        <w:tc>
-          <w:tcPr>
-            <w:tcW w:w="2126" w:type="dxa"/>
-            <w:tcBorders>
-              <w:top w:val="nil"/>
-              <w:left w:val="nil"/>
-              <w:bottom w:val="single" w:sz="4" w:space="0" w:color="auto"/>
-              <w:right w:val="single" w:sz="4" w:space="0" w:color="auto"/>
-            </w:tcBorders>
-            <w:noWrap/>
-            <w:vAlign w:val="bottom"/>
-            <w:hideMark/>
-          </w:tcPr>
-          <w:p>
-            <w:pPr>
-              <w:spacing w:after="0" w:line="240" w:lineRule="auto"/>
-              <w:rPr>
-                <w:rFonts w:eastAsia="Times New Roman" w:cstheme="minorHAnsi"/>
-                <w:color w:val="000000"/>
-                <w:sz w:val="20"/>
-                <w:szCs w:val="20"/>
-                <w:lang w:eastAsia="en-PH"/>
-              </w:rPr>
-            </w:pPr>
-            <w:r>
-              <w:rPr>
-                <w:rFonts w:eastAsia="Times New Roman" w:cstheme="minorHAnsi"/>
-                <w:color w:val="000000"/>
-                <w:sz w:val="20"/>
-                <w:szCs w:val="20"/>
-                <w:lang w:eastAsia="en-PH"/>
-              </w:rPr>
-              <w:t xml:space="preserve">Desktop imaging </w:t>
-            </w:r>
-          </w:p>
-        </w:tc>
-        <w:tc>
-          <w:tcPr>
-            <w:tcW w:w="3126" w:type="dxa"/>
-            <w:tcBorders>
-              <w:top w:val="nil"/>
-              <w:left w:val="nil"/>
-              <w:bottom w:val="single" w:sz="4" w:space="0" w:color="auto"/>
-              <w:right w:val="single" w:sz="4" w:space="0" w:color="auto"/>
-            </w:tcBorders>
-            <w:noWrap/>
-            <w:vAlign w:val="bottom"/>
-          </w:tcPr>
-          <w:p>
-            <w:pPr>
-              <w:spacing w:after="0" w:line="240" w:lineRule="auto"/>
-              <w:rPr>
-                <w:rFonts w:eastAsia="Times New Roman" w:cstheme="minorHAnsi"/>
-                <w:color w:val="000000"/>
-                <w:sz w:val="20"/>
-                <w:szCs w:val="20"/>
-                <w:lang w:eastAsia="en-PH"/>
-              </w:rPr>
-            </w:pPr>
-            <w:r>
-              <w:rPr>
-                <w:rFonts w:eastAsia="Times New Roman" w:cstheme="minorHAnsi"/>
-                <w:color w:val="000000"/>
-                <w:sz w:val="20"/>
-                <w:szCs w:val="20"/>
-                <w:lang w:eastAsia="en-PH"/>
-              </w:rPr>
-              <w:t>4/25/23 – 5/12/23</w:t>
-            </w:r>
-          </w:p>
-        </w:tc>
-        <w:tc>
-          <w:tcPr>
-            <w:tcW w:w="222" w:type="dxa"/>
-            <w:vAlign w:val="center"/>
-            <w:hideMark/>
-          </w:tcPr>
-          <w:p>
-            <w:pPr>
-              <w:spacing w:after="0" w:line="240" w:lineRule="auto"/>
-              <w:rPr>
-                <w:rFonts w:eastAsia="Times New Roman" w:cstheme="minorHAnsi"/>
-                <w:sz w:val="18"/>
-                <w:szCs w:val="18"/>
-                <w:lang w:eastAsia="en-PH"/>
-              </w:rPr>
-            </w:pPr>
-          </w:p>
-        </w:tc>
-      </w:tr>
-      <w:tr>
-        <w:trPr>
-          <w:trHeight w:val="290"/>
-        </w:trPr>
-        <w:tc>
-          <w:tcPr>
-            <w:tcW w:w="4957" w:type="dxa"/>
-            <w:gridSpan w:val="2"/>
-            <w:vMerge/>
-            <w:tcBorders>
-              <w:top w:val="single" w:sz="4" w:space="0" w:color="auto"/>
-              <w:left w:val="single" w:sz="4" w:space="0" w:color="auto"/>
-              <w:bottom w:val="single" w:sz="4" w:space="0" w:color="auto"/>
-              <w:right w:val="single" w:sz="4" w:space="0" w:color="auto"/>
-            </w:tcBorders>
-            <w:vAlign w:val="center"/>
-            <w:hideMark/>
-          </w:tcPr>
-          <w:p>
-            <w:pPr>
-              <w:spacing w:after="0" w:line="240" w:lineRule="auto"/>
-              <w:rPr>
-                <w:rFonts w:eastAsia="Times New Roman" w:cstheme="minorHAnsi"/>
-                <w:color w:val="000000"/>
-                <w:sz w:val="20"/>
-                <w:szCs w:val="20"/>
-                <w:lang w:eastAsia="en-PH"/>
-              </w:rPr>
-            </w:pPr>
-          </w:p>
-        </w:tc>
-        <w:tc>
-          <w:tcPr>
-            <w:tcW w:w="2126" w:type="dxa"/>
-            <w:tcBorders>
-              <w:top w:val="nil"/>
-              <w:left w:val="nil"/>
-              <w:bottom w:val="single" w:sz="4" w:space="0" w:color="auto"/>
-              <w:right w:val="single" w:sz="4" w:space="0" w:color="auto"/>
-            </w:tcBorders>
-            <w:noWrap/>
-            <w:vAlign w:val="bottom"/>
-            <w:hideMark/>
-          </w:tcPr>
-          <w:p>
-            <w:pPr>
-              <w:spacing w:after="0" w:line="240" w:lineRule="auto"/>
-              <w:rPr>
-                <w:rFonts w:eastAsia="Times New Roman" w:cstheme="minorHAnsi"/>
-                <w:color w:val="000000"/>
-                <w:sz w:val="20"/>
-                <w:szCs w:val="20"/>
-                <w:lang w:eastAsia="en-PH"/>
-              </w:rPr>
-            </w:pPr>
-            <w:r>
-              <w:rPr>
-                <w:rFonts w:eastAsia="Times New Roman" w:cstheme="minorHAnsi"/>
-                <w:color w:val="000000"/>
-                <w:sz w:val="20"/>
-                <w:szCs w:val="20"/>
-                <w:lang w:eastAsia="en-PH"/>
-              </w:rPr>
-              <w:t>IT asset deployment</w:t>
-            </w:r>
-          </w:p>
-        </w:tc>
-        <w:tc>
-          <w:tcPr>
-            <w:tcW w:w="3126" w:type="dxa"/>
-            <w:tcBorders>
-              <w:top w:val="nil"/>
-              <w:left w:val="nil"/>
-              <w:bottom w:val="single" w:sz="4" w:space="0" w:color="auto"/>
-              <w:right w:val="single" w:sz="4" w:space="0" w:color="auto"/>
-            </w:tcBorders>
-            <w:noWrap/>
-            <w:vAlign w:val="bottom"/>
-          </w:tcPr>
-          <w:p>
-            <w:pPr>
-              <w:spacing w:after="0" w:line="240" w:lineRule="auto"/>
-              <w:rPr>
-                <w:rFonts w:eastAsia="Times New Roman" w:cstheme="minorHAnsi"/>
-                <w:color w:val="000000"/>
-                <w:sz w:val="20"/>
-                <w:szCs w:val="20"/>
-                <w:lang w:eastAsia="en-PH"/>
-              </w:rPr>
-            </w:pPr>
-            <w:r>
-              <w:rPr>
-                <w:rFonts w:eastAsia="Times New Roman" w:cstheme="minorHAnsi"/>
-                <w:color w:val="000000"/>
-                <w:sz w:val="20"/>
-                <w:szCs w:val="20"/>
-                <w:lang w:eastAsia="en-PH"/>
-              </w:rPr>
-              <w:t>4/25/23 – 5/12/23</w:t>
-            </w:r>
-          </w:p>
-        </w:tc>
-        <w:tc>
-          <w:tcPr>
-            <w:tcW w:w="222" w:type="dxa"/>
-            <w:vAlign w:val="center"/>
-            <w:hideMark/>
-          </w:tcPr>
-          <w:p>
-            <w:pPr>
-              <w:spacing w:after="0" w:line="240" w:lineRule="auto"/>
-              <w:rPr>
-                <w:rFonts w:eastAsia="Times New Roman" w:cstheme="minorHAnsi"/>
-                <w:sz w:val="18"/>
-                <w:szCs w:val="18"/>
-                <w:lang w:eastAsia="en-PH"/>
-              </w:rPr>
-            </w:pPr>
-          </w:p>
-        </w:tc>
-      </w:tr>
-      <w:tr>
-        <w:trPr>
-          <w:trHeight w:val="290"/>
-        </w:trPr>
-        <w:tc>
-          <w:tcPr>
-            <w:tcW w:w="4957" w:type="dxa"/>
-            <w:gridSpan w:val="2"/>
-            <w:vMerge/>
-            <w:tcBorders>
-              <w:top w:val="single" w:sz="4" w:space="0" w:color="auto"/>
-              <w:left w:val="single" w:sz="4" w:space="0" w:color="auto"/>
-              <w:bottom w:val="single" w:sz="4" w:space="0" w:color="auto"/>
-              <w:right w:val="single" w:sz="4" w:space="0" w:color="auto"/>
-            </w:tcBorders>
-            <w:vAlign w:val="center"/>
-            <w:hideMark/>
-          </w:tcPr>
-          <w:p>
-            <w:pPr>
-              <w:spacing w:after="0" w:line="240" w:lineRule="auto"/>
-              <w:rPr>
-                <w:rFonts w:eastAsia="Times New Roman" w:cstheme="minorHAnsi"/>
-                <w:color w:val="000000"/>
-                <w:sz w:val="20"/>
-                <w:szCs w:val="20"/>
-                <w:lang w:eastAsia="en-PH"/>
-              </w:rPr>
-            </w:pPr>
-          </w:p>
-        </w:tc>
-        <w:tc>
-          <w:tcPr>
-            <w:tcW w:w="2126" w:type="dxa"/>
-            <w:tcBorders>
-              <w:top w:val="nil"/>
-              <w:left w:val="nil"/>
-              <w:bottom w:val="single" w:sz="4" w:space="0" w:color="auto"/>
-              <w:right w:val="single" w:sz="4" w:space="0" w:color="auto"/>
-            </w:tcBorders>
-            <w:noWrap/>
-            <w:vAlign w:val="bottom"/>
-            <w:hideMark/>
-          </w:tcPr>
-          <w:p>
-            <w:pPr>
-              <w:spacing w:after="0" w:line="240" w:lineRule="auto"/>
-              <w:rPr>
-                <w:rFonts w:eastAsia="Times New Roman" w:cstheme="minorHAnsi"/>
-                <w:color w:val="000000"/>
-                <w:sz w:val="20"/>
-                <w:szCs w:val="20"/>
-                <w:lang w:eastAsia="en-PH"/>
-              </w:rPr>
-            </w:pPr>
-            <w:r>
-              <w:rPr>
-                <w:rFonts w:eastAsia="Times New Roman" w:cstheme="minorHAnsi"/>
-                <w:color w:val="000000"/>
-                <w:sz w:val="20"/>
-                <w:szCs w:val="20"/>
-                <w:lang w:eastAsia="en-PH"/>
-              </w:rPr>
-              <w:t xml:space="preserve">UAT </w:t>
-            </w:r>
-          </w:p>
-        </w:tc>
-        <w:tc>
-          <w:tcPr>
-            <w:tcW w:w="3126" w:type="dxa"/>
-            <w:tcBorders>
-              <w:top w:val="nil"/>
-              <w:left w:val="nil"/>
-              <w:bottom w:val="single" w:sz="4" w:space="0" w:color="auto"/>
-              <w:right w:val="single" w:sz="4" w:space="0" w:color="auto"/>
-            </w:tcBorders>
-            <w:noWrap/>
-            <w:vAlign w:val="bottom"/>
-            <w:hideMark/>
-          </w:tcPr>
-          <w:p>
-            <w:pPr>
-              <w:spacing w:after="0" w:line="240" w:lineRule="auto"/>
-              <w:rPr>
-                <w:rFonts w:eastAsia="Times New Roman" w:cstheme="minorHAnsi"/>
-                <w:color w:val="000000"/>
-                <w:sz w:val="20"/>
-                <w:szCs w:val="20"/>
-                <w:lang w:eastAsia="en-PH"/>
-              </w:rPr>
-            </w:pPr>
-            <w:r>
-              <w:rPr>
-                <w:rFonts w:eastAsia="Times New Roman" w:cstheme="minorHAnsi"/>
-                <w:color w:val="000000"/>
-                <w:sz w:val="20"/>
-                <w:szCs w:val="20"/>
-                <w:lang w:eastAsia="en-PH"/>
-              </w:rPr>
-              <w:t>5/10/23 – 5/12/23</w:t>
-            </w:r>
-          </w:p>
-        </w:tc>
-        <w:tc>
-          <w:tcPr>
-            <w:tcW w:w="222" w:type="dxa"/>
-            <w:vAlign w:val="center"/>
-            <w:hideMark/>
-          </w:tcPr>
-          <w:p>
-            <w:pPr>
-              <w:spacing w:after="0" w:line="240" w:lineRule="auto"/>
-              <w:rPr>
-                <w:rFonts w:eastAsia="Times New Roman" w:cstheme="minorHAnsi"/>
-                <w:sz w:val="18"/>
-                <w:szCs w:val="18"/>
                 <w:lang w:eastAsia="en-PH"/>
               </w:rPr>
             </w:pPr>
@@ -8289,6 +6667,26 @@
 </file>
 
 <file path=customXml/item1.xml><?xml version="1.0" encoding="utf-8"?>
+<p:properties xmlns:p="http://schemas.microsoft.com/office/2006/metadata/properties" xmlns:xsi="http://www.w3.org/2001/XMLSchema-instance" xmlns:pc="http://schemas.microsoft.com/office/infopath/2007/PartnerControls">
+  <documentManagement>
+    <TaxCatchAll xmlns="0dae1a23-ddb4-4eba-a433-47e22cdb4a29" xsi:nil="true"/>
+    <lcf76f155ced4ddcb4097134ff3c332f xmlns="22738c83-3c95-4cf8-ba40-6da65e878864">
+      <Terms xmlns="http://schemas.microsoft.com/office/infopath/2007/PartnerControls"/>
+    </lcf76f155ced4ddcb4097134ff3c332f>
+  </documentManagement>
+</p:properties>
+</file>
+
+<file path=customXml/item2.xml><?xml version="1.0" encoding="utf-8"?>
+<?mso-contentType ?>
+<FormTemplates xmlns="http://schemas.microsoft.com/sharepoint/v3/contenttype/forms">
+  <Display>DocumentLibraryForm</Display>
+  <Edit>DocumentLibraryForm</Edit>
+  <New>DocumentLibraryForm</New>
+</FormTemplates>
+</file>
+
+<file path=customXml/item3.xml><?xml version="1.0" encoding="utf-8"?>
 <ct:contentTypeSchema xmlns:ct="http://schemas.microsoft.com/office/2006/metadata/contentType" xmlns:ma="http://schemas.microsoft.com/office/2006/metadata/properties/metaAttributes" ct:_="" ma:_="" ma:contentTypeName="Document" ma:contentTypeID="0x010100CF2B0A146BEEBD44B4B87AD78E8166E9" ma:contentTypeVersion="14" ma:contentTypeDescription="Create a new document." ma:contentTypeScope="" ma:versionID="974999a5efe88d9413864a111b22b3b8">
   <xsd:schema xmlns:xsd="http://www.w3.org/2001/XMLSchema" xmlns:xs="http://www.w3.org/2001/XMLSchema" xmlns:p="http://schemas.microsoft.com/office/2006/metadata/properties" xmlns:ns2="22738c83-3c95-4cf8-ba40-6da65e878864" xmlns:ns3="0dae1a23-ddb4-4eba-a433-47e22cdb4a29" targetNamespace="http://schemas.microsoft.com/office/2006/metadata/properties" ma:root="true" ma:fieldsID="11c4aa90183203401bfa6e46ef89706a" ns2:_="" ns3:_="">
     <xsd:import namespace="22738c83-3c95-4cf8-ba40-6da65e878864"/>
@@ -8519,27 +6917,26 @@
 </ct:contentTypeSchema>
 </file>
 
-<file path=customXml/item2.xml><?xml version="1.0" encoding="utf-8"?>
-<?mso-contentType ?>
-<FormTemplates xmlns="http://schemas.microsoft.com/sharepoint/v3/contenttype/forms">
-  <Display>DocumentLibraryForm</Display>
-  <Edit>DocumentLibraryForm</Edit>
-  <New>DocumentLibraryForm</New>
-</FormTemplates>
+<file path=customXml/itemProps1.xml><?xml version="1.0" encoding="utf-8"?>
+<ds:datastoreItem xmlns:ds="http://schemas.openxmlformats.org/officeDocument/2006/customXml" ds:itemID="{8AA554AD-6D9B-4E7D-A50C-4A5912FB6E83}">
+  <ds:schemaRefs>
+    <ds:schemaRef ds:uri="http://schemas.microsoft.com/office/2006/metadata/properties"/>
+    <ds:schemaRef ds:uri="http://schemas.microsoft.com/office/infopath/2007/PartnerControls"/>
+    <ds:schemaRef ds:uri="0dae1a23-ddb4-4eba-a433-47e22cdb4a29"/>
+    <ds:schemaRef ds:uri="22738c83-3c95-4cf8-ba40-6da65e878864"/>
+  </ds:schemaRefs>
+</ds:datastoreItem>
 </file>
 
-<file path=customXml/item3.xml><?xml version="1.0" encoding="utf-8"?>
-<p:properties xmlns:p="http://schemas.microsoft.com/office/2006/metadata/properties" xmlns:xsi="http://www.w3.org/2001/XMLSchema-instance" xmlns:pc="http://schemas.microsoft.com/office/infopath/2007/PartnerControls">
-  <documentManagement>
-    <TaxCatchAll xmlns="0dae1a23-ddb4-4eba-a433-47e22cdb4a29" xsi:nil="true"/>
-    <lcf76f155ced4ddcb4097134ff3c332f xmlns="22738c83-3c95-4cf8-ba40-6da65e878864">
-      <Terms xmlns="http://schemas.microsoft.com/office/infopath/2007/PartnerControls"/>
-    </lcf76f155ced4ddcb4097134ff3c332f>
-  </documentManagement>
-</p:properties>
+<file path=customXml/itemProps2.xml><?xml version="1.0" encoding="utf-8"?>
+<ds:datastoreItem xmlns:ds="http://schemas.openxmlformats.org/officeDocument/2006/customXml" ds:itemID="{7F37CE30-5FF0-430A-9857-74C9675BDF96}">
+  <ds:schemaRefs>
+    <ds:schemaRef ds:uri="http://schemas.microsoft.com/sharepoint/v3/contenttype/forms"/>
+  </ds:schemaRefs>
+</ds:datastoreItem>
 </file>
 
-<file path=customXml/itemProps1.xml><?xml version="1.0" encoding="utf-8"?>
+<file path=customXml/itemProps3.xml><?xml version="1.0" encoding="utf-8"?>
 <ds:datastoreItem xmlns:ds="http://schemas.openxmlformats.org/officeDocument/2006/customXml" ds:itemID="{72597D05-82C6-41FE-B593-4D8DCD12F70D}">
   <ds:schemaRefs>
     <ds:schemaRef ds:uri="http://schemas.microsoft.com/office/2006/metadata/contentType"/>
@@ -8556,23 +6953,4 @@
     <ds:schemaRef ds:uri="http://schemas.microsoft.com/internal/obd"/>
   </ds:schemaRefs>
 </ds:datastoreItem>
-</file>
-
-<file path=customXml/itemProps2.xml><?xml version="1.0" encoding="utf-8"?>
-<ds:datastoreItem xmlns:ds="http://schemas.openxmlformats.org/officeDocument/2006/customXml" ds:itemID="{7F37CE30-5FF0-430A-9857-74C9675BDF96}">
-  <ds:schemaRefs>
-    <ds:schemaRef ds:uri="http://schemas.microsoft.com/sharepoint/v3/contenttype/forms"/>
-  </ds:schemaRefs>
-</ds:datastoreItem>
-</file>
-
-<file path=customXml/itemProps3.xml><?xml version="1.0" encoding="utf-8"?>
-<ds:datastoreItem xmlns:ds="http://schemas.openxmlformats.org/officeDocument/2006/customXml" ds:itemID="{8AA554AD-6D9B-4E7D-A50C-4A5912FB6E83}">
-  <ds:schemaRefs>
-    <ds:schemaRef ds:uri="http://schemas.microsoft.com/office/2006/metadata/properties"/>
-    <ds:schemaRef ds:uri="http://schemas.microsoft.com/office/infopath/2007/PartnerControls"/>
-    <ds:schemaRef ds:uri="0dae1a23-ddb4-4eba-a433-47e22cdb4a29"/>
-    <ds:schemaRef ds:uri="22738c83-3c95-4cf8-ba40-6da65e878864"/>
-  </ds:schemaRefs>
-</ds:datastoreItem>
 </file>
</xml_diff>